<commit_message>
JPvsPOP and S1 smallN analysis Big Update (July-Aug 2026)
Covers work done during July26 vacation and early Aug26 progress.
- S1 small-N analysis reached a narrative milestone
- JPvsPOP implemented in Matlab and works quite well
</commit_message>
<xml_diff>
--- a/Data/Redundancy 2024/Modelling/POPCDM/modelfit_popcdm_redundancy2024.docx
+++ b/Data/Redundancy 2024/Modelling/POPCDM/modelfit_popcdm_redundancy2024.docx
@@ -86,7 +86,6 @@
                 <w:szCs w:val="18"/>
               </w:rPr>
             </w:pPr>
-            <w:proofErr w:type="spellStart"/>
             <w:r>
               <w:rPr>
                 <w:rFonts w:ascii="Lucida Sans" w:hAnsi="Lucida Sans"/>
@@ -98,7 +97,6 @@
               </w:rPr>
               <w:t>uid</w:t>
             </w:r>
-            <w:proofErr w:type="spellEnd"/>
           </w:p>
           <w:p>
             <w:pPr>
@@ -213,7 +211,6 @@
                 <w:szCs w:val="18"/>
               </w:rPr>
             </w:pPr>
-            <w:proofErr w:type="spellStart"/>
             <w:r>
               <w:rPr>
                 <w:rFonts w:ascii="Lucida Sans" w:hAnsi="Lucida Sans"/>
@@ -225,7 +222,6 @@
               </w:rPr>
               <w:t>n_trials</w:t>
             </w:r>
-            <w:proofErr w:type="spellEnd"/>
           </w:p>
           <w:p>
             <w:pPr>
@@ -279,7 +275,6 @@
                 <w:szCs w:val="18"/>
               </w:rPr>
             </w:pPr>
-            <w:proofErr w:type="spellStart"/>
             <w:r>
               <w:rPr>
                 <w:rFonts w:ascii="Lucida Sans" w:hAnsi="Lucida Sans"/>
@@ -291,7 +286,6 @@
               </w:rPr>
               <w:t>np_free</w:t>
             </w:r>
-            <w:proofErr w:type="spellEnd"/>
           </w:p>
           <w:p>
             <w:pPr>
@@ -345,7 +339,6 @@
                 <w:szCs w:val="18"/>
               </w:rPr>
             </w:pPr>
-            <w:proofErr w:type="spellStart"/>
             <w:r>
               <w:rPr>
                 <w:rFonts w:ascii="Lucida Sans" w:hAnsi="Lucida Sans"/>
@@ -357,7 +350,6 @@
               </w:rPr>
               <w:t>nll</w:t>
             </w:r>
-            <w:proofErr w:type="spellEnd"/>
           </w:p>
           <w:p>
             <w:pPr>
@@ -376,27 +368,7 @@
                 <w:sz w:val="17"/>
                 <w:szCs w:val="17"/>
               </w:rPr>
-              <w:t>&lt;</w:t>
-            </w:r>
-            <w:proofErr w:type="spellStart"/>
-            <w:r>
-              <w:rPr>
-                <w:rFonts w:ascii="Lucida Sans" w:hAnsi="Lucida Sans"/>
-                <w:color w:val="F8F8F2"/>
-                <w:sz w:val="17"/>
-                <w:szCs w:val="17"/>
-              </w:rPr>
-              <w:t>dbl</w:t>
-            </w:r>
-            <w:proofErr w:type="spellEnd"/>
-            <w:r>
-              <w:rPr>
-                <w:rFonts w:ascii="Lucida Sans" w:hAnsi="Lucida Sans"/>
-                <w:color w:val="F8F8F2"/>
-                <w:sz w:val="17"/>
-                <w:szCs w:val="17"/>
-              </w:rPr>
-              <w:t>&gt;</w:t>
+              <w:t>&lt;dbl&gt;</w:t>
             </w:r>
           </w:p>
         </w:tc>
@@ -686,13 +658,8 @@
       <w:pPr>
         <w:ind w:left="720" w:hanging="720"/>
       </w:pPr>
-      <w:proofErr w:type="spellStart"/>
       <w:r>
-        <w:t>alphaEst</w:t>
-      </w:r>
-      <w:proofErr w:type="spellEnd"/>
-      <w:r>
-        <w:t xml:space="preserve">           20.000000000           </w:t>
+        <w:t xml:space="preserve">alphaEst           20.000000000           </w:t>
       </w:r>
     </w:p>
     <w:p>
@@ -793,6 +760,11 @@
       </w:r>
     </w:p>
     <w:p>
+      <w:pPr>
+        <w:rPr>
+          <w:lang w:val="en-US"/>
+        </w:rPr>
+      </w:pPr>
       <w:r>
         <w:t xml:space="preserve">kappa_set4_baseline      9.280993893         </w:t>
       </w:r>
@@ -809,15 +781,7 @@
     </w:p>
     <w:p>
       <w:r>
-        <w:t>kappa_set6_</w:t>
-      </w:r>
-      <w:proofErr w:type="gramStart"/>
-      <w:r>
-        <w:t>baseline  1.433064271</w:t>
-      </w:r>
-      <w:proofErr w:type="gramEnd"/>
-      <w:r>
-        <w:t xml:space="preserve">          </w:t>
+        <w:t xml:space="preserve">kappa_set6_baseline  1.433064271          </w:t>
       </w:r>
     </w:p>
     <w:p>
@@ -830,15 +794,7 @@
     </w:p>
     <w:p>
       <w:r>
-        <w:t>kappa_set6_NR_cue_ci</w:t>
-      </w:r>
-      <w:proofErr w:type="gramStart"/>
-      <w:r>
-        <w:t>2  13.705210202</w:t>
-      </w:r>
-      <w:proofErr w:type="gramEnd"/>
-      <w:r>
-        <w:t xml:space="preserve">          </w:t>
+        <w:t xml:space="preserve">kappa_set6_NR_cue_ci2  13.705210202          </w:t>
       </w:r>
     </w:p>
     <w:p>
@@ -996,15 +952,7 @@
         <w:ind w:left="720" w:hanging="720"/>
       </w:pPr>
       <w:r>
-        <w:t>eta1_set6_R_cue_ci</w:t>
-      </w:r>
-      <w:proofErr w:type="gramStart"/>
-      <w:r>
-        <w:t>2  1.700373517</w:t>
-      </w:r>
-      <w:proofErr w:type="gramEnd"/>
-      <w:r>
-        <w:t xml:space="preserve">           </w:t>
+        <w:t xml:space="preserve">eta1_set6_R_cue_ci2  1.700373517           </w:t>
       </w:r>
     </w:p>
     <w:p>
@@ -1020,15 +968,7 @@
         <w:ind w:left="720" w:hanging="720"/>
       </w:pPr>
       <w:r>
-        <w:t>eta1_set6_R_cue_ci</w:t>
-      </w:r>
-      <w:proofErr w:type="gramStart"/>
-      <w:r>
-        <w:t>4  1.700373517</w:t>
-      </w:r>
-      <w:proofErr w:type="gramEnd"/>
-      <w:r>
-        <w:t xml:space="preserve">           </w:t>
+        <w:t xml:space="preserve">eta1_set6_R_cue_ci4  1.700373517           </w:t>
       </w:r>
     </w:p>
     <w:p>
@@ -1096,7 +1036,6 @@
                 <w:szCs w:val="18"/>
               </w:rPr>
             </w:pPr>
-            <w:proofErr w:type="spellStart"/>
             <w:r>
               <w:rPr>
                 <w:rFonts w:ascii="Lucida Sans" w:hAnsi="Lucida Sans"/>
@@ -1108,7 +1047,6 @@
               </w:rPr>
               <w:t>cond_label</w:t>
             </w:r>
-            <w:proofErr w:type="spellEnd"/>
           </w:p>
           <w:p>
             <w:pPr>
@@ -1190,27 +1128,7 @@
                 <w:sz w:val="17"/>
                 <w:szCs w:val="17"/>
               </w:rPr>
-              <w:t>&lt;</w:t>
-            </w:r>
-            <w:proofErr w:type="spellStart"/>
-            <w:r>
-              <w:rPr>
-                <w:rFonts w:ascii="Lucida Sans" w:hAnsi="Lucida Sans"/>
-                <w:color w:val="F8F8F2"/>
-                <w:sz w:val="17"/>
-                <w:szCs w:val="17"/>
-              </w:rPr>
-              <w:t>dbl</w:t>
-            </w:r>
-            <w:proofErr w:type="spellEnd"/>
-            <w:r>
-              <w:rPr>
-                <w:rFonts w:ascii="Lucida Sans" w:hAnsi="Lucida Sans"/>
-                <w:color w:val="F8F8F2"/>
-                <w:sz w:val="17"/>
-                <w:szCs w:val="17"/>
-              </w:rPr>
-              <w:t>&gt;</w:t>
+              <w:t>&lt;dbl&gt;</w:t>
             </w:r>
           </w:p>
         </w:tc>
@@ -1274,27 +1192,7 @@
                 <w:sz w:val="17"/>
                 <w:szCs w:val="17"/>
               </w:rPr>
-              <w:t>&lt;</w:t>
-            </w:r>
-            <w:proofErr w:type="spellStart"/>
-            <w:r>
-              <w:rPr>
-                <w:rFonts w:ascii="Lucida Sans" w:hAnsi="Lucida Sans"/>
-                <w:color w:val="F8F8F2"/>
-                <w:sz w:val="17"/>
-                <w:szCs w:val="17"/>
-              </w:rPr>
-              <w:t>dbl</w:t>
-            </w:r>
-            <w:proofErr w:type="spellEnd"/>
-            <w:r>
-              <w:rPr>
-                <w:rFonts w:ascii="Lucida Sans" w:hAnsi="Lucida Sans"/>
-                <w:color w:val="F8F8F2"/>
-                <w:sz w:val="17"/>
-                <w:szCs w:val="17"/>
-              </w:rPr>
-              <w:t>&gt;</w:t>
+              <w:t>&lt;dbl&gt;</w:t>
             </w:r>
           </w:p>
         </w:tc>
@@ -1358,27 +1256,7 @@
                 <w:sz w:val="17"/>
                 <w:szCs w:val="17"/>
               </w:rPr>
-              <w:t>&lt;</w:t>
-            </w:r>
-            <w:proofErr w:type="spellStart"/>
-            <w:r>
-              <w:rPr>
-                <w:rFonts w:ascii="Lucida Sans" w:hAnsi="Lucida Sans"/>
-                <w:color w:val="F8F8F2"/>
-                <w:sz w:val="17"/>
-                <w:szCs w:val="17"/>
-              </w:rPr>
-              <w:t>dbl</w:t>
-            </w:r>
-            <w:proofErr w:type="spellEnd"/>
-            <w:r>
-              <w:rPr>
-                <w:rFonts w:ascii="Lucida Sans" w:hAnsi="Lucida Sans"/>
-                <w:color w:val="F8F8F2"/>
-                <w:sz w:val="17"/>
-                <w:szCs w:val="17"/>
-              </w:rPr>
-              <w:t>&gt;</w:t>
+              <w:t>&lt;dbl&gt;</w:t>
             </w:r>
           </w:p>
         </w:tc>
@@ -1442,27 +1320,7 @@
                 <w:sz w:val="17"/>
                 <w:szCs w:val="17"/>
               </w:rPr>
-              <w:t>&lt;</w:t>
-            </w:r>
-            <w:proofErr w:type="spellStart"/>
-            <w:r>
-              <w:rPr>
-                <w:rFonts w:ascii="Lucida Sans" w:hAnsi="Lucida Sans"/>
-                <w:color w:val="F8F8F2"/>
-                <w:sz w:val="17"/>
-                <w:szCs w:val="17"/>
-              </w:rPr>
-              <w:t>dbl</w:t>
-            </w:r>
-            <w:proofErr w:type="spellEnd"/>
-            <w:r>
-              <w:rPr>
-                <w:rFonts w:ascii="Lucida Sans" w:hAnsi="Lucida Sans"/>
-                <w:color w:val="F8F8F2"/>
-                <w:sz w:val="17"/>
-                <w:szCs w:val="17"/>
-              </w:rPr>
-              <w:t>&gt;</w:t>
+              <w:t>&lt;dbl&gt;</w:t>
             </w:r>
           </w:p>
         </w:tc>
@@ -1526,27 +1384,7 @@
                 <w:sz w:val="17"/>
                 <w:szCs w:val="17"/>
               </w:rPr>
-              <w:t>&lt;</w:t>
-            </w:r>
-            <w:proofErr w:type="spellStart"/>
-            <w:r>
-              <w:rPr>
-                <w:rFonts w:ascii="Lucida Sans" w:hAnsi="Lucida Sans"/>
-                <w:color w:val="F8F8F2"/>
-                <w:sz w:val="17"/>
-                <w:szCs w:val="17"/>
-              </w:rPr>
-              <w:t>dbl</w:t>
-            </w:r>
-            <w:proofErr w:type="spellEnd"/>
-            <w:r>
-              <w:rPr>
-                <w:rFonts w:ascii="Lucida Sans" w:hAnsi="Lucida Sans"/>
-                <w:color w:val="F8F8F2"/>
-                <w:sz w:val="17"/>
-                <w:szCs w:val="17"/>
-              </w:rPr>
-              <w:t>&gt;</w:t>
+              <w:t>&lt;dbl&gt;</w:t>
             </w:r>
           </w:p>
         </w:tc>
@@ -3577,37 +3415,12 @@
         </w:rPr>
         <w:t xml:space="preserve">Model: </w:t>
       </w:r>
-      <w:proofErr w:type="spellStart"/>
       <w:r>
         <w:rPr>
           <w:b/>
           <w:bCs/>
         </w:rPr>
-        <w:t>vkt</w:t>
-      </w:r>
-      <w:proofErr w:type="spellEnd"/>
-      <w:r>
-        <w:rPr>
-          <w:b/>
-          <w:bCs/>
-        </w:rPr>
-        <w:t xml:space="preserve"> follow </w:t>
-      </w:r>
-      <w:proofErr w:type="spellStart"/>
-      <w:r>
-        <w:rPr>
-          <w:b/>
-          <w:bCs/>
-        </w:rPr>
-        <w:t>color</w:t>
-      </w:r>
-      <w:proofErr w:type="spellEnd"/>
-      <w:r>
-        <w:rPr>
-          <w:b/>
-          <w:bCs/>
-        </w:rPr>
-        <w:t xml:space="preserve">-count </w:t>
+        <w:t xml:space="preserve">vkt follow color-count </w:t>
       </w:r>
       <w:r>
         <w:rPr>
@@ -4350,7 +4163,6 @@
                 <w:bCs/>
               </w:rPr>
             </w:pPr>
-            <w:proofErr w:type="spellStart"/>
             <w:r>
               <w:rPr>
                 <w:b/>
@@ -4358,7 +4170,6 @@
               </w:rPr>
               <w:t>alphaEst</w:t>
             </w:r>
-            <w:proofErr w:type="spellEnd"/>
           </w:p>
         </w:tc>
         <w:tc>
@@ -6929,7 +6740,6 @@
                 <w:szCs w:val="17"/>
               </w:rPr>
             </w:pPr>
-            <w:proofErr w:type="spellStart"/>
             <w:r>
               <w:rPr>
                 <w:b/>
@@ -6937,7 +6747,6 @@
               </w:rPr>
               <w:t>alphaEst</w:t>
             </w:r>
-            <w:proofErr w:type="spellEnd"/>
           </w:p>
         </w:tc>
         <w:tc>
@@ -9282,7 +9091,6 @@
                 <w:szCs w:val="17"/>
               </w:rPr>
             </w:pPr>
-            <w:proofErr w:type="spellStart"/>
             <w:r>
               <w:rPr>
                 <w:b/>
@@ -9290,7 +9098,6 @@
               </w:rPr>
               <w:t>alphaEst</w:t>
             </w:r>
-            <w:proofErr w:type="spellEnd"/>
           </w:p>
         </w:tc>
         <w:tc>
@@ -11637,7 +11444,6 @@
                 <w:szCs w:val="17"/>
               </w:rPr>
             </w:pPr>
-            <w:proofErr w:type="spellStart"/>
             <w:r>
               <w:rPr>
                 <w:b/>
@@ -11645,7 +11451,6 @@
               </w:rPr>
               <w:t>alphaEst</w:t>
             </w:r>
-            <w:proofErr w:type="spellEnd"/>
           </w:p>
         </w:tc>
         <w:tc>
@@ -13991,7 +13796,6 @@
                 <w:szCs w:val="17"/>
               </w:rPr>
             </w:pPr>
-            <w:proofErr w:type="spellStart"/>
             <w:r>
               <w:rPr>
                 <w:b/>
@@ -13999,7 +13803,6 @@
               </w:rPr>
               <w:t>alphaEst</w:t>
             </w:r>
-            <w:proofErr w:type="spellEnd"/>
           </w:p>
         </w:tc>
         <w:tc>
@@ -16255,7 +16058,6 @@
       <w:r>
         <w:t xml:space="preserve">: </w:t>
       </w:r>
-      <w:proofErr w:type="spellStart"/>
       <w:r>
         <w:rPr>
           <w:b/>
@@ -16263,49 +16065,8 @@
         </w:rPr>
         <w:t>alphaEst</w:t>
       </w:r>
-      <w:proofErr w:type="spellEnd"/>
       <w:r>
-        <w:t xml:space="preserve"> is the single amplitude parameter in the model. For each trial, </w:t>
-      </w:r>
-      <w:proofErr w:type="spellStart"/>
-      <w:r>
-        <w:t>alpha_trial</w:t>
-      </w:r>
-      <w:proofErr w:type="spellEnd"/>
-      <w:r>
-        <w:t xml:space="preserve"> = </w:t>
-      </w:r>
-      <w:proofErr w:type="spellStart"/>
-      <w:r>
-        <w:t>alphaEst</w:t>
-      </w:r>
-      <w:proofErr w:type="spellEnd"/>
-      <w:r>
-        <w:t xml:space="preserve"> * 2^bj * ci^-</w:t>
-      </w:r>
-      <w:proofErr w:type="spellStart"/>
-      <w:r>
-        <w:t>bj</w:t>
-      </w:r>
-      <w:proofErr w:type="spellEnd"/>
-      <w:r>
-        <w:t xml:space="preserve"> * </w:t>
-      </w:r>
-      <w:proofErr w:type="spellStart"/>
-      <w:r>
-        <w:t>ri^bj</w:t>
-      </w:r>
-      <w:proofErr w:type="spellEnd"/>
-      <w:r>
-        <w:t xml:space="preserve">, where ci = colour count and </w:t>
-      </w:r>
-      <w:proofErr w:type="spellStart"/>
-      <w:r>
-        <w:t>ri</w:t>
-      </w:r>
-      <w:proofErr w:type="spellEnd"/>
-      <w:r>
-        <w:t xml:space="preserve"> = redundant count. The power exponent parameter b has 3 copies, where j index trial type (base, R, NR). </w:t>
+        <w:t xml:space="preserve"> is the single amplitude parameter in the model. For each trial, alpha_trial = alphaEst * 2^bj * ci^-bj * ri^bj, where ci = colour count and ri = redundant count. The power exponent parameter b has 3 copies, where j index trial type (base, R, NR). </w:t>
       </w:r>
     </w:p>
     <w:p>
@@ -16406,21 +16167,8 @@
           <w:numId w:val="1"/>
         </w:numPr>
       </w:pPr>
-      <w:proofErr w:type="spellStart"/>
       <w:r>
-        <w:t>Cladulate</w:t>
-      </w:r>
-      <w:proofErr w:type="spellEnd"/>
-      <w:r>
-        <w:t xml:space="preserve"> inverse </w:t>
-      </w:r>
-      <w:proofErr w:type="spellStart"/>
-      <w:r>
-        <w:t>CirSD</w:t>
-      </w:r>
-      <w:proofErr w:type="spellEnd"/>
-      <w:r>
-        <w:t xml:space="preserve">, not on data, but on the memory dist. (use est alpha and kappa in </w:t>
+        <w:t xml:space="preserve">Cladulate inverse CirSD, not on data, but on the memory dist. (use est alpha and kappa in </w:t>
       </w:r>
     </w:p>
     <w:p>
@@ -16500,7 +16248,6 @@
                 <w:szCs w:val="18"/>
               </w:rPr>
             </w:pPr>
-            <w:proofErr w:type="spellStart"/>
             <w:r>
               <w:rPr>
                 <w:rFonts w:ascii="Lucida Sans" w:hAnsi="Lucida Sans"/>
@@ -16512,7 +16259,6 @@
               </w:rPr>
               <w:t>uid</w:t>
             </w:r>
-            <w:proofErr w:type="spellEnd"/>
           </w:p>
           <w:p>
             <w:pPr>
@@ -16627,7 +16373,6 @@
                 <w:szCs w:val="18"/>
               </w:rPr>
             </w:pPr>
-            <w:proofErr w:type="spellStart"/>
             <w:r>
               <w:rPr>
                 <w:rFonts w:ascii="Lucida Sans" w:hAnsi="Lucida Sans"/>
@@ -16639,7 +16384,6 @@
               </w:rPr>
               <w:t>n_trials</w:t>
             </w:r>
-            <w:proofErr w:type="spellEnd"/>
           </w:p>
           <w:p>
             <w:pPr>
@@ -16693,7 +16437,6 @@
                 <w:szCs w:val="18"/>
               </w:rPr>
             </w:pPr>
-            <w:proofErr w:type="spellStart"/>
             <w:r>
               <w:rPr>
                 <w:rFonts w:ascii="Lucida Sans" w:hAnsi="Lucida Sans"/>
@@ -16705,7 +16448,6 @@
               </w:rPr>
               <w:t>np_free</w:t>
             </w:r>
-            <w:proofErr w:type="spellEnd"/>
           </w:p>
           <w:p>
             <w:pPr>
@@ -16759,7 +16501,6 @@
                 <w:szCs w:val="18"/>
               </w:rPr>
             </w:pPr>
-            <w:proofErr w:type="spellStart"/>
             <w:r>
               <w:rPr>
                 <w:rFonts w:ascii="Lucida Sans" w:hAnsi="Lucida Sans"/>
@@ -16771,7 +16512,6 @@
               </w:rPr>
               <w:t>nll</w:t>
             </w:r>
-            <w:proofErr w:type="spellEnd"/>
           </w:p>
           <w:p>
             <w:pPr>
@@ -16790,27 +16530,7 @@
                 <w:sz w:val="17"/>
                 <w:szCs w:val="17"/>
               </w:rPr>
-              <w:t>&lt;</w:t>
-            </w:r>
-            <w:proofErr w:type="spellStart"/>
-            <w:r>
-              <w:rPr>
-                <w:rFonts w:ascii="Lucida Sans" w:hAnsi="Lucida Sans"/>
-                <w:color w:val="F8F8F2"/>
-                <w:sz w:val="17"/>
-                <w:szCs w:val="17"/>
-              </w:rPr>
-              <w:t>dbl</w:t>
-            </w:r>
-            <w:proofErr w:type="spellEnd"/>
-            <w:r>
-              <w:rPr>
-                <w:rFonts w:ascii="Lucida Sans" w:hAnsi="Lucida Sans"/>
-                <w:color w:val="F8F8F2"/>
-                <w:sz w:val="17"/>
-                <w:szCs w:val="17"/>
-              </w:rPr>
-              <w:t>&gt;</w:t>
+              <w:t>&lt;dbl&gt;</w:t>
             </w:r>
           </w:p>
         </w:tc>
@@ -16874,27 +16594,7 @@
                 <w:sz w:val="17"/>
                 <w:szCs w:val="17"/>
               </w:rPr>
-              <w:t>&lt;</w:t>
-            </w:r>
-            <w:proofErr w:type="spellStart"/>
-            <w:r>
-              <w:rPr>
-                <w:rFonts w:ascii="Lucida Sans" w:hAnsi="Lucida Sans"/>
-                <w:color w:val="F8F8F2"/>
-                <w:sz w:val="17"/>
-                <w:szCs w:val="17"/>
-              </w:rPr>
-              <w:t>dbl</w:t>
-            </w:r>
-            <w:proofErr w:type="spellEnd"/>
-            <w:r>
-              <w:rPr>
-                <w:rFonts w:ascii="Lucida Sans" w:hAnsi="Lucida Sans"/>
-                <w:color w:val="F8F8F2"/>
-                <w:sz w:val="17"/>
-                <w:szCs w:val="17"/>
-              </w:rPr>
-              <w:t>&gt;</w:t>
+              <w:t>&lt;dbl&gt;</w:t>
             </w:r>
           </w:p>
         </w:tc>
@@ -16958,27 +16658,7 @@
                 <w:sz w:val="17"/>
                 <w:szCs w:val="17"/>
               </w:rPr>
-              <w:t>&lt;</w:t>
-            </w:r>
-            <w:proofErr w:type="spellStart"/>
-            <w:r>
-              <w:rPr>
-                <w:rFonts w:ascii="Lucida Sans" w:hAnsi="Lucida Sans"/>
-                <w:color w:val="F8F8F2"/>
-                <w:sz w:val="17"/>
-                <w:szCs w:val="17"/>
-              </w:rPr>
-              <w:t>dbl</w:t>
-            </w:r>
-            <w:proofErr w:type="spellEnd"/>
-            <w:r>
-              <w:rPr>
-                <w:rFonts w:ascii="Lucida Sans" w:hAnsi="Lucida Sans"/>
-                <w:color w:val="F8F8F2"/>
-                <w:sz w:val="17"/>
-                <w:szCs w:val="17"/>
-              </w:rPr>
-              <w:t>&gt;</w:t>
+              <w:t>&lt;dbl&gt;</w:t>
             </w:r>
           </w:p>
         </w:tc>
@@ -17111,7 +16791,6 @@
                 <w:szCs w:val="18"/>
               </w:rPr>
             </w:pPr>
-            <w:proofErr w:type="spellStart"/>
             <w:r>
               <w:rPr>
                 <w:rFonts w:ascii="Lucida Sans" w:hAnsi="Lucida Sans"/>
@@ -17121,7 +16800,6 @@
               </w:rPr>
               <w:t>scaling_branch_kappa_beta_base_nr_r</w:t>
             </w:r>
-            <w:proofErr w:type="spellEnd"/>
           </w:p>
         </w:tc>
         <w:tc>
@@ -17409,7 +17087,6 @@
                 <w:szCs w:val="18"/>
               </w:rPr>
             </w:pPr>
-            <w:proofErr w:type="spellStart"/>
             <w:r>
               <w:rPr>
                 <w:rFonts w:ascii="Lucida Sans" w:hAnsi="Lucida Sans"/>
@@ -17421,7 +17098,6 @@
               </w:rPr>
               <w:t>uid</w:t>
             </w:r>
-            <w:proofErr w:type="spellEnd"/>
           </w:p>
           <w:p>
             <w:pPr>
@@ -17473,7 +17149,6 @@
                 <w:szCs w:val="18"/>
               </w:rPr>
             </w:pPr>
-            <w:proofErr w:type="spellStart"/>
             <w:r>
               <w:rPr>
                 <w:rFonts w:ascii="Lucida Sans" w:hAnsi="Lucida Sans"/>
@@ -17485,7 +17160,6 @@
               </w:rPr>
               <w:t>cond_label</w:t>
             </w:r>
-            <w:proofErr w:type="spellEnd"/>
           </w:p>
           <w:p>
             <w:pPr>
@@ -17567,27 +17241,7 @@
                 <w:sz w:val="17"/>
                 <w:szCs w:val="17"/>
               </w:rPr>
-              <w:t>&lt;</w:t>
-            </w:r>
-            <w:proofErr w:type="spellStart"/>
-            <w:r>
-              <w:rPr>
-                <w:rFonts w:ascii="Lucida Sans" w:hAnsi="Lucida Sans"/>
-                <w:color w:val="F8F8F2"/>
-                <w:sz w:val="17"/>
-                <w:szCs w:val="17"/>
-              </w:rPr>
-              <w:t>dbl</w:t>
-            </w:r>
-            <w:proofErr w:type="spellEnd"/>
-            <w:r>
-              <w:rPr>
-                <w:rFonts w:ascii="Lucida Sans" w:hAnsi="Lucida Sans"/>
-                <w:color w:val="F8F8F2"/>
-                <w:sz w:val="17"/>
-                <w:szCs w:val="17"/>
-              </w:rPr>
-              <w:t>&gt;</w:t>
+              <w:t>&lt;dbl&gt;</w:t>
             </w:r>
           </w:p>
         </w:tc>
@@ -17651,27 +17305,7 @@
                 <w:sz w:val="17"/>
                 <w:szCs w:val="17"/>
               </w:rPr>
-              <w:t>&lt;</w:t>
-            </w:r>
-            <w:proofErr w:type="spellStart"/>
-            <w:r>
-              <w:rPr>
-                <w:rFonts w:ascii="Lucida Sans" w:hAnsi="Lucida Sans"/>
-                <w:color w:val="F8F8F2"/>
-                <w:sz w:val="17"/>
-                <w:szCs w:val="17"/>
-              </w:rPr>
-              <w:t>dbl</w:t>
-            </w:r>
-            <w:proofErr w:type="spellEnd"/>
-            <w:r>
-              <w:rPr>
-                <w:rFonts w:ascii="Lucida Sans" w:hAnsi="Lucida Sans"/>
-                <w:color w:val="F8F8F2"/>
-                <w:sz w:val="17"/>
-                <w:szCs w:val="17"/>
-              </w:rPr>
-              <w:t>&gt;</w:t>
+              <w:t>&lt;dbl&gt;</w:t>
             </w:r>
           </w:p>
         </w:tc>
@@ -17706,7 +17340,6 @@
                 <w:szCs w:val="18"/>
               </w:rPr>
             </w:pPr>
-            <w:proofErr w:type="spellStart"/>
             <w:r>
               <w:rPr>
                 <w:rFonts w:ascii="Lucida Sans" w:hAnsi="Lucida Sans"/>
@@ -17718,7 +17351,6 @@
               </w:rPr>
               <w:t>alpha_trial</w:t>
             </w:r>
-            <w:proofErr w:type="spellEnd"/>
           </w:p>
           <w:p>
             <w:pPr>
@@ -17737,27 +17369,7 @@
                 <w:sz w:val="17"/>
                 <w:szCs w:val="17"/>
               </w:rPr>
-              <w:t>&lt;</w:t>
-            </w:r>
-            <w:proofErr w:type="spellStart"/>
-            <w:r>
-              <w:rPr>
-                <w:rFonts w:ascii="Lucida Sans" w:hAnsi="Lucida Sans"/>
-                <w:color w:val="F8F8F2"/>
-                <w:sz w:val="17"/>
-                <w:szCs w:val="17"/>
-              </w:rPr>
-              <w:t>dbl</w:t>
-            </w:r>
-            <w:proofErr w:type="spellEnd"/>
-            <w:r>
-              <w:rPr>
-                <w:rFonts w:ascii="Lucida Sans" w:hAnsi="Lucida Sans"/>
-                <w:color w:val="F8F8F2"/>
-                <w:sz w:val="17"/>
-                <w:szCs w:val="17"/>
-              </w:rPr>
-              <w:t>&gt;</w:t>
+              <w:t>&lt;dbl&gt;</w:t>
             </w:r>
           </w:p>
         </w:tc>
@@ -17792,7 +17404,6 @@
                 <w:szCs w:val="18"/>
               </w:rPr>
             </w:pPr>
-            <w:proofErr w:type="spellStart"/>
             <w:r>
               <w:rPr>
                 <w:rFonts w:ascii="Lucida Sans" w:hAnsi="Lucida Sans"/>
@@ -17804,7 +17415,6 @@
               </w:rPr>
               <w:t>kappa_trial</w:t>
             </w:r>
-            <w:proofErr w:type="spellEnd"/>
           </w:p>
           <w:p>
             <w:pPr>
@@ -17823,27 +17433,7 @@
                 <w:sz w:val="17"/>
                 <w:szCs w:val="17"/>
               </w:rPr>
-              <w:t>&lt;</w:t>
-            </w:r>
-            <w:proofErr w:type="spellStart"/>
-            <w:r>
-              <w:rPr>
-                <w:rFonts w:ascii="Lucida Sans" w:hAnsi="Lucida Sans"/>
-                <w:color w:val="F8F8F2"/>
-                <w:sz w:val="17"/>
-                <w:szCs w:val="17"/>
-              </w:rPr>
-              <w:t>dbl</w:t>
-            </w:r>
-            <w:proofErr w:type="spellEnd"/>
-            <w:r>
-              <w:rPr>
-                <w:rFonts w:ascii="Lucida Sans" w:hAnsi="Lucida Sans"/>
-                <w:color w:val="F8F8F2"/>
-                <w:sz w:val="17"/>
-                <w:szCs w:val="17"/>
-              </w:rPr>
-              <w:t>&gt;</w:t>
+              <w:t>&lt;dbl&gt;</w:t>
             </w:r>
           </w:p>
         </w:tc>
@@ -17907,27 +17497,7 @@
                 <w:sz w:val="17"/>
                 <w:szCs w:val="17"/>
               </w:rPr>
-              <w:t>&lt;</w:t>
-            </w:r>
-            <w:proofErr w:type="spellStart"/>
-            <w:r>
-              <w:rPr>
-                <w:rFonts w:ascii="Lucida Sans" w:hAnsi="Lucida Sans"/>
-                <w:color w:val="F8F8F2"/>
-                <w:sz w:val="17"/>
-                <w:szCs w:val="17"/>
-              </w:rPr>
-              <w:t>dbl</w:t>
-            </w:r>
-            <w:proofErr w:type="spellEnd"/>
-            <w:r>
-              <w:rPr>
-                <w:rFonts w:ascii="Lucida Sans" w:hAnsi="Lucida Sans"/>
-                <w:color w:val="F8F8F2"/>
-                <w:sz w:val="17"/>
-                <w:szCs w:val="17"/>
-              </w:rPr>
-              <w:t>&gt;</w:t>
+              <w:t>&lt;dbl&gt;</w:t>
             </w:r>
           </w:p>
         </w:tc>
@@ -17991,27 +17561,7 @@
                 <w:sz w:val="17"/>
                 <w:szCs w:val="17"/>
               </w:rPr>
-              <w:t>&lt;</w:t>
-            </w:r>
-            <w:proofErr w:type="spellStart"/>
-            <w:r>
-              <w:rPr>
-                <w:rFonts w:ascii="Lucida Sans" w:hAnsi="Lucida Sans"/>
-                <w:color w:val="F8F8F2"/>
-                <w:sz w:val="17"/>
-                <w:szCs w:val="17"/>
-              </w:rPr>
-              <w:t>dbl</w:t>
-            </w:r>
-            <w:proofErr w:type="spellEnd"/>
-            <w:r>
-              <w:rPr>
-                <w:rFonts w:ascii="Lucida Sans" w:hAnsi="Lucida Sans"/>
-                <w:color w:val="F8F8F2"/>
-                <w:sz w:val="17"/>
-                <w:szCs w:val="17"/>
-              </w:rPr>
-              <w:t>&gt;</w:t>
+              <w:t>&lt;dbl&gt;</w:t>
             </w:r>
           </w:p>
         </w:tc>
@@ -18075,27 +17625,7 @@
                 <w:sz w:val="17"/>
                 <w:szCs w:val="17"/>
               </w:rPr>
-              <w:t>&lt;</w:t>
-            </w:r>
-            <w:proofErr w:type="spellStart"/>
-            <w:r>
-              <w:rPr>
-                <w:rFonts w:ascii="Lucida Sans" w:hAnsi="Lucida Sans"/>
-                <w:color w:val="F8F8F2"/>
-                <w:sz w:val="17"/>
-                <w:szCs w:val="17"/>
-              </w:rPr>
-              <w:t>dbl</w:t>
-            </w:r>
-            <w:proofErr w:type="spellEnd"/>
-            <w:r>
-              <w:rPr>
-                <w:rFonts w:ascii="Lucida Sans" w:hAnsi="Lucida Sans"/>
-                <w:color w:val="F8F8F2"/>
-                <w:sz w:val="17"/>
-                <w:szCs w:val="17"/>
-              </w:rPr>
-              <w:t>&gt;</w:t>
+              <w:t>&lt;dbl&gt;</w:t>
             </w:r>
           </w:p>
         </w:tc>
@@ -18159,27 +17689,7 @@
                 <w:sz w:val="17"/>
                 <w:szCs w:val="17"/>
               </w:rPr>
-              <w:t>&lt;</w:t>
-            </w:r>
-            <w:proofErr w:type="spellStart"/>
-            <w:r>
-              <w:rPr>
-                <w:rFonts w:ascii="Lucida Sans" w:hAnsi="Lucida Sans"/>
-                <w:color w:val="F8F8F2"/>
-                <w:sz w:val="17"/>
-                <w:szCs w:val="17"/>
-              </w:rPr>
-              <w:t>dbl</w:t>
-            </w:r>
-            <w:proofErr w:type="spellEnd"/>
-            <w:r>
-              <w:rPr>
-                <w:rFonts w:ascii="Lucida Sans" w:hAnsi="Lucida Sans"/>
-                <w:color w:val="F8F8F2"/>
-                <w:sz w:val="17"/>
-                <w:szCs w:val="17"/>
-              </w:rPr>
-              <w:t>&gt;</w:t>
+              <w:t>&lt;dbl&gt;</w:t>
             </w:r>
           </w:p>
         </w:tc>
@@ -21526,7 +21036,6 @@
                 <w:szCs w:val="18"/>
               </w:rPr>
             </w:pPr>
-            <w:proofErr w:type="spellStart"/>
             <w:r>
               <w:rPr>
                 <w:rFonts w:ascii="Lucida Sans" w:hAnsi="Lucida Sans"/>
@@ -21538,7 +21047,6 @@
               </w:rPr>
               <w:t>uid</w:t>
             </w:r>
-            <w:proofErr w:type="spellEnd"/>
           </w:p>
           <w:p>
             <w:pPr>
@@ -21653,7 +21161,6 @@
                 <w:szCs w:val="18"/>
               </w:rPr>
             </w:pPr>
-            <w:proofErr w:type="spellStart"/>
             <w:r>
               <w:rPr>
                 <w:rFonts w:ascii="Lucida Sans" w:hAnsi="Lucida Sans"/>
@@ -21665,7 +21172,6 @@
               </w:rPr>
               <w:t>n_trials</w:t>
             </w:r>
-            <w:proofErr w:type="spellEnd"/>
           </w:p>
           <w:p>
             <w:pPr>
@@ -21719,7 +21225,6 @@
                 <w:szCs w:val="18"/>
               </w:rPr>
             </w:pPr>
-            <w:proofErr w:type="spellStart"/>
             <w:r>
               <w:rPr>
                 <w:rFonts w:ascii="Lucida Sans" w:hAnsi="Lucida Sans"/>
@@ -21731,7 +21236,6 @@
               </w:rPr>
               <w:t>np_free</w:t>
             </w:r>
-            <w:proofErr w:type="spellEnd"/>
           </w:p>
           <w:p>
             <w:pPr>
@@ -21785,7 +21289,6 @@
                 <w:szCs w:val="18"/>
               </w:rPr>
             </w:pPr>
-            <w:proofErr w:type="spellStart"/>
             <w:r>
               <w:rPr>
                 <w:rFonts w:ascii="Lucida Sans" w:hAnsi="Lucida Sans"/>
@@ -21797,7 +21300,6 @@
               </w:rPr>
               <w:t>nll</w:t>
             </w:r>
-            <w:proofErr w:type="spellEnd"/>
           </w:p>
           <w:p>
             <w:pPr>
@@ -21816,27 +21318,7 @@
                 <w:sz w:val="17"/>
                 <w:szCs w:val="17"/>
               </w:rPr>
-              <w:t>&lt;</w:t>
-            </w:r>
-            <w:proofErr w:type="spellStart"/>
-            <w:r>
-              <w:rPr>
-                <w:rFonts w:ascii="Lucida Sans" w:hAnsi="Lucida Sans"/>
-                <w:color w:val="F8F8F2"/>
-                <w:sz w:val="17"/>
-                <w:szCs w:val="17"/>
-              </w:rPr>
-              <w:t>dbl</w:t>
-            </w:r>
-            <w:proofErr w:type="spellEnd"/>
-            <w:r>
-              <w:rPr>
-                <w:rFonts w:ascii="Lucida Sans" w:hAnsi="Lucida Sans"/>
-                <w:color w:val="F8F8F2"/>
-                <w:sz w:val="17"/>
-                <w:szCs w:val="17"/>
-              </w:rPr>
-              <w:t>&gt;</w:t>
+              <w:t>&lt;dbl&gt;</w:t>
             </w:r>
           </w:p>
         </w:tc>
@@ -21900,27 +21382,7 @@
                 <w:sz w:val="17"/>
                 <w:szCs w:val="17"/>
               </w:rPr>
-              <w:t>&lt;</w:t>
-            </w:r>
-            <w:proofErr w:type="spellStart"/>
-            <w:r>
-              <w:rPr>
-                <w:rFonts w:ascii="Lucida Sans" w:hAnsi="Lucida Sans"/>
-                <w:color w:val="F8F8F2"/>
-                <w:sz w:val="17"/>
-                <w:szCs w:val="17"/>
-              </w:rPr>
-              <w:t>dbl</w:t>
-            </w:r>
-            <w:proofErr w:type="spellEnd"/>
-            <w:r>
-              <w:rPr>
-                <w:rFonts w:ascii="Lucida Sans" w:hAnsi="Lucida Sans"/>
-                <w:color w:val="F8F8F2"/>
-                <w:sz w:val="17"/>
-                <w:szCs w:val="17"/>
-              </w:rPr>
-              <w:t>&gt;</w:t>
+              <w:t>&lt;dbl&gt;</w:t>
             </w:r>
           </w:p>
         </w:tc>
@@ -21984,27 +21446,7 @@
                 <w:sz w:val="17"/>
                 <w:szCs w:val="17"/>
               </w:rPr>
-              <w:t>&lt;</w:t>
-            </w:r>
-            <w:proofErr w:type="spellStart"/>
-            <w:r>
-              <w:rPr>
-                <w:rFonts w:ascii="Lucida Sans" w:hAnsi="Lucida Sans"/>
-                <w:color w:val="F8F8F2"/>
-                <w:sz w:val="17"/>
-                <w:szCs w:val="17"/>
-              </w:rPr>
-              <w:t>dbl</w:t>
-            </w:r>
-            <w:proofErr w:type="spellEnd"/>
-            <w:r>
-              <w:rPr>
-                <w:rFonts w:ascii="Lucida Sans" w:hAnsi="Lucida Sans"/>
-                <w:color w:val="F8F8F2"/>
-                <w:sz w:val="17"/>
-                <w:szCs w:val="17"/>
-              </w:rPr>
-              <w:t>&gt;</w:t>
+              <w:t>&lt;dbl&gt;</w:t>
             </w:r>
           </w:p>
         </w:tc>
@@ -22135,7 +21577,6 @@
                 <w:szCs w:val="18"/>
               </w:rPr>
             </w:pPr>
-            <w:proofErr w:type="spellStart"/>
             <w:r>
               <w:rPr>
                 <w:rFonts w:ascii="Lucida Sans" w:hAnsi="Lucida Sans"/>
@@ -22145,7 +21586,6 @@
               </w:rPr>
               <w:t>scaling_branch_none_base_nr_r</w:t>
             </w:r>
-            <w:proofErr w:type="spellEnd"/>
           </w:p>
         </w:tc>
         <w:tc>
@@ -22421,7 +21861,6 @@
                 <w:szCs w:val="18"/>
               </w:rPr>
             </w:pPr>
-            <w:proofErr w:type="spellStart"/>
             <w:r>
               <w:rPr>
                 <w:rFonts w:ascii="Lucida Sans" w:hAnsi="Lucida Sans"/>
@@ -22434,7 +21873,6 @@
               <w:lastRenderedPageBreak/>
               <w:t>uid</w:t>
             </w:r>
-            <w:proofErr w:type="spellEnd"/>
           </w:p>
           <w:p>
             <w:pPr>
@@ -22486,7 +21924,6 @@
                 <w:szCs w:val="18"/>
               </w:rPr>
             </w:pPr>
-            <w:proofErr w:type="spellStart"/>
             <w:r>
               <w:rPr>
                 <w:rFonts w:ascii="Lucida Sans" w:hAnsi="Lucida Sans"/>
@@ -22498,7 +21935,6 @@
               </w:rPr>
               <w:t>cond_label</w:t>
             </w:r>
-            <w:proofErr w:type="spellEnd"/>
           </w:p>
           <w:p>
             <w:pPr>
@@ -22580,27 +22016,7 @@
                 <w:sz w:val="17"/>
                 <w:szCs w:val="17"/>
               </w:rPr>
-              <w:t>&lt;</w:t>
-            </w:r>
-            <w:proofErr w:type="spellStart"/>
-            <w:r>
-              <w:rPr>
-                <w:rFonts w:ascii="Lucida Sans" w:hAnsi="Lucida Sans"/>
-                <w:color w:val="F8F8F2"/>
-                <w:sz w:val="17"/>
-                <w:szCs w:val="17"/>
-              </w:rPr>
-              <w:t>dbl</w:t>
-            </w:r>
-            <w:proofErr w:type="spellEnd"/>
-            <w:r>
-              <w:rPr>
-                <w:rFonts w:ascii="Lucida Sans" w:hAnsi="Lucida Sans"/>
-                <w:color w:val="F8F8F2"/>
-                <w:sz w:val="17"/>
-                <w:szCs w:val="17"/>
-              </w:rPr>
-              <w:t>&gt;</w:t>
+              <w:t>&lt;dbl&gt;</w:t>
             </w:r>
           </w:p>
         </w:tc>
@@ -22664,27 +22080,7 @@
                 <w:sz w:val="17"/>
                 <w:szCs w:val="17"/>
               </w:rPr>
-              <w:t>&lt;</w:t>
-            </w:r>
-            <w:proofErr w:type="spellStart"/>
-            <w:r>
-              <w:rPr>
-                <w:rFonts w:ascii="Lucida Sans" w:hAnsi="Lucida Sans"/>
-                <w:color w:val="F8F8F2"/>
-                <w:sz w:val="17"/>
-                <w:szCs w:val="17"/>
-              </w:rPr>
-              <w:t>dbl</w:t>
-            </w:r>
-            <w:proofErr w:type="spellEnd"/>
-            <w:r>
-              <w:rPr>
-                <w:rFonts w:ascii="Lucida Sans" w:hAnsi="Lucida Sans"/>
-                <w:color w:val="F8F8F2"/>
-                <w:sz w:val="17"/>
-                <w:szCs w:val="17"/>
-              </w:rPr>
-              <w:t>&gt;</w:t>
+              <w:t>&lt;dbl&gt;</w:t>
             </w:r>
           </w:p>
         </w:tc>
@@ -22719,7 +22115,6 @@
                 <w:szCs w:val="18"/>
               </w:rPr>
             </w:pPr>
-            <w:proofErr w:type="spellStart"/>
             <w:r>
               <w:rPr>
                 <w:rFonts w:ascii="Lucida Sans" w:hAnsi="Lucida Sans"/>
@@ -22731,7 +22126,6 @@
               </w:rPr>
               <w:t>alpha_trial</w:t>
             </w:r>
-            <w:proofErr w:type="spellEnd"/>
           </w:p>
           <w:p>
             <w:pPr>
@@ -22750,27 +22144,7 @@
                 <w:sz w:val="17"/>
                 <w:szCs w:val="17"/>
               </w:rPr>
-              <w:t>&lt;</w:t>
-            </w:r>
-            <w:proofErr w:type="spellStart"/>
-            <w:r>
-              <w:rPr>
-                <w:rFonts w:ascii="Lucida Sans" w:hAnsi="Lucida Sans"/>
-                <w:color w:val="F8F8F2"/>
-                <w:sz w:val="17"/>
-                <w:szCs w:val="17"/>
-              </w:rPr>
-              <w:t>dbl</w:t>
-            </w:r>
-            <w:proofErr w:type="spellEnd"/>
-            <w:r>
-              <w:rPr>
-                <w:rFonts w:ascii="Lucida Sans" w:hAnsi="Lucida Sans"/>
-                <w:color w:val="F8F8F2"/>
-                <w:sz w:val="17"/>
-                <w:szCs w:val="17"/>
-              </w:rPr>
-              <w:t>&gt;</w:t>
+              <w:t>&lt;dbl&gt;</w:t>
             </w:r>
           </w:p>
         </w:tc>
@@ -22805,7 +22179,6 @@
                 <w:szCs w:val="18"/>
               </w:rPr>
             </w:pPr>
-            <w:proofErr w:type="spellStart"/>
             <w:r>
               <w:rPr>
                 <w:rFonts w:ascii="Lucida Sans" w:hAnsi="Lucida Sans"/>
@@ -22817,7 +22190,6 @@
               </w:rPr>
               <w:t>kappa_trial</w:t>
             </w:r>
-            <w:proofErr w:type="spellEnd"/>
           </w:p>
           <w:p>
             <w:pPr>
@@ -22836,27 +22208,7 @@
                 <w:sz w:val="17"/>
                 <w:szCs w:val="17"/>
               </w:rPr>
-              <w:t>&lt;</w:t>
-            </w:r>
-            <w:proofErr w:type="spellStart"/>
-            <w:r>
-              <w:rPr>
-                <w:rFonts w:ascii="Lucida Sans" w:hAnsi="Lucida Sans"/>
-                <w:color w:val="F8F8F2"/>
-                <w:sz w:val="17"/>
-                <w:szCs w:val="17"/>
-              </w:rPr>
-              <w:t>dbl</w:t>
-            </w:r>
-            <w:proofErr w:type="spellEnd"/>
-            <w:r>
-              <w:rPr>
-                <w:rFonts w:ascii="Lucida Sans" w:hAnsi="Lucida Sans"/>
-                <w:color w:val="F8F8F2"/>
-                <w:sz w:val="17"/>
-                <w:szCs w:val="17"/>
-              </w:rPr>
-              <w:t>&gt;</w:t>
+              <w:t>&lt;dbl&gt;</w:t>
             </w:r>
           </w:p>
         </w:tc>
@@ -22920,27 +22272,7 @@
                 <w:sz w:val="17"/>
                 <w:szCs w:val="17"/>
               </w:rPr>
-              <w:t>&lt;</w:t>
-            </w:r>
-            <w:proofErr w:type="spellStart"/>
-            <w:r>
-              <w:rPr>
-                <w:rFonts w:ascii="Lucida Sans" w:hAnsi="Lucida Sans"/>
-                <w:color w:val="F8F8F2"/>
-                <w:sz w:val="17"/>
-                <w:szCs w:val="17"/>
-              </w:rPr>
-              <w:t>dbl</w:t>
-            </w:r>
-            <w:proofErr w:type="spellEnd"/>
-            <w:r>
-              <w:rPr>
-                <w:rFonts w:ascii="Lucida Sans" w:hAnsi="Lucida Sans"/>
-                <w:color w:val="F8F8F2"/>
-                <w:sz w:val="17"/>
-                <w:szCs w:val="17"/>
-              </w:rPr>
-              <w:t>&gt;</w:t>
+              <w:t>&lt;dbl&gt;</w:t>
             </w:r>
           </w:p>
         </w:tc>
@@ -23004,27 +22336,7 @@
                 <w:sz w:val="17"/>
                 <w:szCs w:val="17"/>
               </w:rPr>
-              <w:t>&lt;</w:t>
-            </w:r>
-            <w:proofErr w:type="spellStart"/>
-            <w:r>
-              <w:rPr>
-                <w:rFonts w:ascii="Lucida Sans" w:hAnsi="Lucida Sans"/>
-                <w:color w:val="F8F8F2"/>
-                <w:sz w:val="17"/>
-                <w:szCs w:val="17"/>
-              </w:rPr>
-              <w:t>dbl</w:t>
-            </w:r>
-            <w:proofErr w:type="spellEnd"/>
-            <w:r>
-              <w:rPr>
-                <w:rFonts w:ascii="Lucida Sans" w:hAnsi="Lucida Sans"/>
-                <w:color w:val="F8F8F2"/>
-                <w:sz w:val="17"/>
-                <w:szCs w:val="17"/>
-              </w:rPr>
-              <w:t>&gt;</w:t>
+              <w:t>&lt;dbl&gt;</w:t>
             </w:r>
           </w:p>
         </w:tc>
@@ -23088,27 +22400,7 @@
                 <w:sz w:val="17"/>
                 <w:szCs w:val="17"/>
               </w:rPr>
-              <w:t>&lt;</w:t>
-            </w:r>
-            <w:proofErr w:type="spellStart"/>
-            <w:r>
-              <w:rPr>
-                <w:rFonts w:ascii="Lucida Sans" w:hAnsi="Lucida Sans"/>
-                <w:color w:val="F8F8F2"/>
-                <w:sz w:val="17"/>
-                <w:szCs w:val="17"/>
-              </w:rPr>
-              <w:t>dbl</w:t>
-            </w:r>
-            <w:proofErr w:type="spellEnd"/>
-            <w:r>
-              <w:rPr>
-                <w:rFonts w:ascii="Lucida Sans" w:hAnsi="Lucida Sans"/>
-                <w:color w:val="F8F8F2"/>
-                <w:sz w:val="17"/>
-                <w:szCs w:val="17"/>
-              </w:rPr>
-              <w:t>&gt;</w:t>
+              <w:t>&lt;dbl&gt;</w:t>
             </w:r>
           </w:p>
         </w:tc>
@@ -23172,27 +22464,7 @@
                 <w:sz w:val="17"/>
                 <w:szCs w:val="17"/>
               </w:rPr>
-              <w:t>&lt;</w:t>
-            </w:r>
-            <w:proofErr w:type="spellStart"/>
-            <w:r>
-              <w:rPr>
-                <w:rFonts w:ascii="Lucida Sans" w:hAnsi="Lucida Sans"/>
-                <w:color w:val="F8F8F2"/>
-                <w:sz w:val="17"/>
-                <w:szCs w:val="17"/>
-              </w:rPr>
-              <w:t>dbl</w:t>
-            </w:r>
-            <w:proofErr w:type="spellEnd"/>
-            <w:r>
-              <w:rPr>
-                <w:rFonts w:ascii="Lucida Sans" w:hAnsi="Lucida Sans"/>
-                <w:color w:val="F8F8F2"/>
-                <w:sz w:val="17"/>
-                <w:szCs w:val="17"/>
-              </w:rPr>
-              <w:t>&gt;</w:t>
+              <w:t>&lt;dbl&gt;</w:t>
             </w:r>
           </w:p>
         </w:tc>
@@ -26437,7 +25709,6 @@
                 <w:szCs w:val="18"/>
               </w:rPr>
             </w:pPr>
-            <w:proofErr w:type="spellStart"/>
             <w:r>
               <w:rPr>
                 <w:rFonts w:ascii="Lucida Sans" w:hAnsi="Lucida Sans"/>
@@ -26449,7 +25720,6 @@
               </w:rPr>
               <w:t>uid</w:t>
             </w:r>
-            <w:proofErr w:type="spellEnd"/>
           </w:p>
           <w:p>
             <w:pPr>
@@ -26501,7 +25771,6 @@
                 <w:szCs w:val="18"/>
               </w:rPr>
             </w:pPr>
-            <w:proofErr w:type="spellStart"/>
             <w:r>
               <w:rPr>
                 <w:rFonts w:ascii="Lucida Sans" w:hAnsi="Lucida Sans"/>
@@ -26513,7 +25782,6 @@
               </w:rPr>
               <w:t>cond_label</w:t>
             </w:r>
-            <w:proofErr w:type="spellEnd"/>
           </w:p>
           <w:p>
             <w:pPr>
@@ -26566,7 +25834,6 @@
                 <w:szCs w:val="18"/>
               </w:rPr>
             </w:pPr>
-            <w:proofErr w:type="spellStart"/>
             <w:r>
               <w:rPr>
                 <w:rFonts w:ascii="Lucida Sans" w:hAnsi="Lucida Sans"/>
@@ -26578,7 +25845,6 @@
               </w:rPr>
               <w:t>alpha_trial</w:t>
             </w:r>
-            <w:proofErr w:type="spellEnd"/>
           </w:p>
           <w:p>
             <w:pPr>
@@ -26597,27 +25863,7 @@
                 <w:sz w:val="17"/>
                 <w:szCs w:val="17"/>
               </w:rPr>
-              <w:t>&lt;</w:t>
-            </w:r>
-            <w:proofErr w:type="spellStart"/>
-            <w:r>
-              <w:rPr>
-                <w:rFonts w:ascii="Lucida Sans" w:hAnsi="Lucida Sans"/>
-                <w:color w:val="F8F8F2"/>
-                <w:sz w:val="17"/>
-                <w:szCs w:val="17"/>
-              </w:rPr>
-              <w:t>dbl</w:t>
-            </w:r>
-            <w:proofErr w:type="spellEnd"/>
-            <w:r>
-              <w:rPr>
-                <w:rFonts w:ascii="Lucida Sans" w:hAnsi="Lucida Sans"/>
-                <w:color w:val="F8F8F2"/>
-                <w:sz w:val="17"/>
-                <w:szCs w:val="17"/>
-              </w:rPr>
-              <w:t>&gt;</w:t>
+              <w:t>&lt;dbl&gt;</w:t>
             </w:r>
           </w:p>
         </w:tc>
@@ -26652,7 +25898,6 @@
                 <w:szCs w:val="18"/>
               </w:rPr>
             </w:pPr>
-            <w:proofErr w:type="spellStart"/>
             <w:r>
               <w:rPr>
                 <w:rFonts w:ascii="Lucida Sans" w:hAnsi="Lucida Sans"/>
@@ -26664,7 +25909,6 @@
               </w:rPr>
               <w:t>kappa_trial</w:t>
             </w:r>
-            <w:proofErr w:type="spellEnd"/>
           </w:p>
           <w:p>
             <w:pPr>
@@ -26683,27 +25927,7 @@
                 <w:sz w:val="17"/>
                 <w:szCs w:val="17"/>
               </w:rPr>
-              <w:t>&lt;</w:t>
-            </w:r>
-            <w:proofErr w:type="spellStart"/>
-            <w:r>
-              <w:rPr>
-                <w:rFonts w:ascii="Lucida Sans" w:hAnsi="Lucida Sans"/>
-                <w:color w:val="F8F8F2"/>
-                <w:sz w:val="17"/>
-                <w:szCs w:val="17"/>
-              </w:rPr>
-              <w:t>dbl</w:t>
-            </w:r>
-            <w:proofErr w:type="spellEnd"/>
-            <w:r>
-              <w:rPr>
-                <w:rFonts w:ascii="Lucida Sans" w:hAnsi="Lucida Sans"/>
-                <w:color w:val="F8F8F2"/>
-                <w:sz w:val="17"/>
-                <w:szCs w:val="17"/>
-              </w:rPr>
-              <w:t>&gt;</w:t>
+              <w:t>&lt;dbl&gt;</w:t>
             </w:r>
           </w:p>
         </w:tc>
@@ -26738,7 +25962,6 @@
                 <w:szCs w:val="18"/>
               </w:rPr>
             </w:pPr>
-            <w:proofErr w:type="spellStart"/>
             <w:r>
               <w:rPr>
                 <w:rFonts w:ascii="Lucida Sans" w:hAnsi="Lucida Sans"/>
@@ -26750,7 +25973,6 @@
               </w:rPr>
               <w:t>cir_sd_deg</w:t>
             </w:r>
-            <w:proofErr w:type="spellEnd"/>
           </w:p>
           <w:p>
             <w:pPr>
@@ -26769,27 +25991,7 @@
                 <w:sz w:val="17"/>
                 <w:szCs w:val="17"/>
               </w:rPr>
-              <w:t>&lt;</w:t>
-            </w:r>
-            <w:proofErr w:type="spellStart"/>
-            <w:r>
-              <w:rPr>
-                <w:rFonts w:ascii="Lucida Sans" w:hAnsi="Lucida Sans"/>
-                <w:color w:val="F8F8F2"/>
-                <w:sz w:val="17"/>
-                <w:szCs w:val="17"/>
-              </w:rPr>
-              <w:t>dbl</w:t>
-            </w:r>
-            <w:proofErr w:type="spellEnd"/>
-            <w:r>
-              <w:rPr>
-                <w:rFonts w:ascii="Lucida Sans" w:hAnsi="Lucida Sans"/>
-                <w:color w:val="F8F8F2"/>
-                <w:sz w:val="17"/>
-                <w:szCs w:val="17"/>
-              </w:rPr>
-              <w:t>&gt;</w:t>
+              <w:t>&lt;dbl&gt;</w:t>
             </w:r>
           </w:p>
         </w:tc>
@@ -26824,7 +26026,6 @@
                 <w:szCs w:val="18"/>
               </w:rPr>
             </w:pPr>
-            <w:proofErr w:type="spellStart"/>
             <w:r>
               <w:rPr>
                 <w:rFonts w:ascii="Lucida Sans" w:hAnsi="Lucida Sans"/>
@@ -26836,7 +26037,6 @@
               </w:rPr>
               <w:t>vm_cir_sd_deg</w:t>
             </w:r>
-            <w:proofErr w:type="spellEnd"/>
           </w:p>
           <w:p>
             <w:pPr>
@@ -26855,27 +26055,7 @@
                 <w:sz w:val="17"/>
                 <w:szCs w:val="17"/>
               </w:rPr>
-              <w:t>&lt;</w:t>
-            </w:r>
-            <w:proofErr w:type="spellStart"/>
-            <w:r>
-              <w:rPr>
-                <w:rFonts w:ascii="Lucida Sans" w:hAnsi="Lucida Sans"/>
-                <w:color w:val="F8F8F2"/>
-                <w:sz w:val="17"/>
-                <w:szCs w:val="17"/>
-              </w:rPr>
-              <w:t>dbl</w:t>
-            </w:r>
-            <w:proofErr w:type="spellEnd"/>
-            <w:r>
-              <w:rPr>
-                <w:rFonts w:ascii="Lucida Sans" w:hAnsi="Lucida Sans"/>
-                <w:color w:val="F8F8F2"/>
-                <w:sz w:val="17"/>
-                <w:szCs w:val="17"/>
-              </w:rPr>
-              <w:t>&gt;</w:t>
+              <w:t>&lt;dbl&gt;</w:t>
             </w:r>
           </w:p>
         </w:tc>
@@ -28872,7 +28052,6 @@
                 <w:szCs w:val="18"/>
               </w:rPr>
             </w:pPr>
-            <w:proofErr w:type="spellStart"/>
             <w:r>
               <w:rPr>
                 <w:rFonts w:ascii="Lucida Sans" w:hAnsi="Lucida Sans"/>
@@ -28884,7 +28063,6 @@
               </w:rPr>
               <w:t>uid</w:t>
             </w:r>
-            <w:proofErr w:type="spellEnd"/>
           </w:p>
           <w:p>
             <w:pPr>
@@ -28999,7 +28177,6 @@
                 <w:szCs w:val="18"/>
               </w:rPr>
             </w:pPr>
-            <w:proofErr w:type="spellStart"/>
             <w:r>
               <w:rPr>
                 <w:rFonts w:ascii="Lucida Sans" w:hAnsi="Lucida Sans"/>
@@ -29011,7 +28188,6 @@
               </w:rPr>
               <w:t>n_trials</w:t>
             </w:r>
-            <w:proofErr w:type="spellEnd"/>
           </w:p>
           <w:p>
             <w:pPr>
@@ -29065,7 +28241,6 @@
                 <w:szCs w:val="18"/>
               </w:rPr>
             </w:pPr>
-            <w:proofErr w:type="spellStart"/>
             <w:r>
               <w:rPr>
                 <w:rFonts w:ascii="Lucida Sans" w:hAnsi="Lucida Sans"/>
@@ -29077,7 +28252,6 @@
               </w:rPr>
               <w:t>np_free</w:t>
             </w:r>
-            <w:proofErr w:type="spellEnd"/>
           </w:p>
           <w:p>
             <w:pPr>
@@ -29131,7 +28305,6 @@
                 <w:szCs w:val="18"/>
               </w:rPr>
             </w:pPr>
-            <w:proofErr w:type="spellStart"/>
             <w:r>
               <w:rPr>
                 <w:rFonts w:ascii="Lucida Sans" w:hAnsi="Lucida Sans"/>
@@ -29143,7 +28316,6 @@
               </w:rPr>
               <w:t>nll</w:t>
             </w:r>
-            <w:proofErr w:type="spellEnd"/>
           </w:p>
           <w:p>
             <w:pPr>
@@ -29163,27 +28335,7 @@
                 <w:sz w:val="17"/>
                 <w:szCs w:val="17"/>
               </w:rPr>
-              <w:t>&lt;</w:t>
-            </w:r>
-            <w:proofErr w:type="spellStart"/>
-            <w:r>
-              <w:rPr>
-                <w:rFonts w:ascii="Lucida Sans" w:hAnsi="Lucida Sans"/>
-                <w:color w:val="F8F8F2"/>
-                <w:sz w:val="17"/>
-                <w:szCs w:val="17"/>
-              </w:rPr>
-              <w:t>dbl</w:t>
-            </w:r>
-            <w:proofErr w:type="spellEnd"/>
-            <w:r>
-              <w:rPr>
-                <w:rFonts w:ascii="Lucida Sans" w:hAnsi="Lucida Sans"/>
-                <w:color w:val="F8F8F2"/>
-                <w:sz w:val="17"/>
-                <w:szCs w:val="17"/>
-              </w:rPr>
-              <w:t>&gt;</w:t>
+              <w:t>&lt;dbl&gt;</w:t>
             </w:r>
           </w:p>
         </w:tc>
@@ -29247,27 +28399,7 @@
                 <w:sz w:val="17"/>
                 <w:szCs w:val="17"/>
               </w:rPr>
-              <w:t>&lt;</w:t>
-            </w:r>
-            <w:proofErr w:type="spellStart"/>
-            <w:r>
-              <w:rPr>
-                <w:rFonts w:ascii="Lucida Sans" w:hAnsi="Lucida Sans"/>
-                <w:color w:val="F8F8F2"/>
-                <w:sz w:val="17"/>
-                <w:szCs w:val="17"/>
-              </w:rPr>
-              <w:t>dbl</w:t>
-            </w:r>
-            <w:proofErr w:type="spellEnd"/>
-            <w:r>
-              <w:rPr>
-                <w:rFonts w:ascii="Lucida Sans" w:hAnsi="Lucida Sans"/>
-                <w:color w:val="F8F8F2"/>
-                <w:sz w:val="17"/>
-                <w:szCs w:val="17"/>
-              </w:rPr>
-              <w:t>&gt;</w:t>
+              <w:t>&lt;dbl&gt;</w:t>
             </w:r>
           </w:p>
         </w:tc>
@@ -29331,27 +28463,7 @@
                 <w:sz w:val="17"/>
                 <w:szCs w:val="17"/>
               </w:rPr>
-              <w:t>&lt;</w:t>
-            </w:r>
-            <w:proofErr w:type="spellStart"/>
-            <w:r>
-              <w:rPr>
-                <w:rFonts w:ascii="Lucida Sans" w:hAnsi="Lucida Sans"/>
-                <w:color w:val="F8F8F2"/>
-                <w:sz w:val="17"/>
-                <w:szCs w:val="17"/>
-              </w:rPr>
-              <w:t>dbl</w:t>
-            </w:r>
-            <w:proofErr w:type="spellEnd"/>
-            <w:r>
-              <w:rPr>
-                <w:rFonts w:ascii="Lucida Sans" w:hAnsi="Lucida Sans"/>
-                <w:color w:val="F8F8F2"/>
-                <w:sz w:val="17"/>
-                <w:szCs w:val="17"/>
-              </w:rPr>
-              <w:t>&gt;</w:t>
+              <w:t>&lt;dbl&gt;</w:t>
             </w:r>
           </w:p>
         </w:tc>
@@ -29482,7 +28594,6 @@
                 <w:szCs w:val="18"/>
               </w:rPr>
             </w:pPr>
-            <w:proofErr w:type="spellStart"/>
             <w:r>
               <w:rPr>
                 <w:rFonts w:ascii="Lucida Sans" w:hAnsi="Lucida Sans"/>
@@ -29492,7 +28603,6 @@
               </w:rPr>
               <w:t>scaling_branch_none_base_nr_r</w:t>
             </w:r>
-            <w:proofErr w:type="spellEnd"/>
           </w:p>
         </w:tc>
         <w:tc>
@@ -29766,7 +28876,6 @@
                 <w:szCs w:val="18"/>
               </w:rPr>
             </w:pPr>
-            <w:proofErr w:type="spellStart"/>
             <w:r>
               <w:rPr>
                 <w:rFonts w:ascii="Lucida Sans" w:hAnsi="Lucida Sans"/>
@@ -29776,7 +28885,6 @@
               </w:rPr>
               <w:t>scaling_branch_none_base_nr_r</w:t>
             </w:r>
-            <w:proofErr w:type="spellEnd"/>
           </w:p>
         </w:tc>
         <w:tc>
@@ -30060,7 +29168,6 @@
                 <w:szCs w:val="18"/>
               </w:rPr>
             </w:pPr>
-            <w:proofErr w:type="spellStart"/>
             <w:r>
               <w:rPr>
                 <w:rFonts w:ascii="Lucida Sans" w:hAnsi="Lucida Sans"/>
@@ -30072,7 +29179,6 @@
               </w:rPr>
               <w:t>uid</w:t>
             </w:r>
-            <w:proofErr w:type="spellEnd"/>
           </w:p>
           <w:p>
             <w:pPr>
@@ -30124,7 +29230,6 @@
                 <w:szCs w:val="18"/>
               </w:rPr>
             </w:pPr>
-            <w:proofErr w:type="spellStart"/>
             <w:r>
               <w:rPr>
                 <w:rFonts w:ascii="Lucida Sans" w:hAnsi="Lucida Sans"/>
@@ -30136,7 +29241,6 @@
               </w:rPr>
               <w:t>cond_label</w:t>
             </w:r>
-            <w:proofErr w:type="spellEnd"/>
           </w:p>
           <w:p>
             <w:pPr>
@@ -30218,27 +29322,7 @@
                 <w:sz w:val="17"/>
                 <w:szCs w:val="17"/>
               </w:rPr>
-              <w:t>&lt;</w:t>
-            </w:r>
-            <w:proofErr w:type="spellStart"/>
-            <w:r>
-              <w:rPr>
-                <w:rFonts w:ascii="Lucida Sans" w:hAnsi="Lucida Sans"/>
-                <w:color w:val="F8F8F2"/>
-                <w:sz w:val="17"/>
-                <w:szCs w:val="17"/>
-              </w:rPr>
-              <w:t>dbl</w:t>
-            </w:r>
-            <w:proofErr w:type="spellEnd"/>
-            <w:r>
-              <w:rPr>
-                <w:rFonts w:ascii="Lucida Sans" w:hAnsi="Lucida Sans"/>
-                <w:color w:val="F8F8F2"/>
-                <w:sz w:val="17"/>
-                <w:szCs w:val="17"/>
-              </w:rPr>
-              <w:t>&gt;</w:t>
+              <w:t>&lt;dbl&gt;</w:t>
             </w:r>
           </w:p>
         </w:tc>
@@ -30302,27 +29386,7 @@
                 <w:sz w:val="17"/>
                 <w:szCs w:val="17"/>
               </w:rPr>
-              <w:t>&lt;</w:t>
-            </w:r>
-            <w:proofErr w:type="spellStart"/>
-            <w:r>
-              <w:rPr>
-                <w:rFonts w:ascii="Lucida Sans" w:hAnsi="Lucida Sans"/>
-                <w:color w:val="F8F8F2"/>
-                <w:sz w:val="17"/>
-                <w:szCs w:val="17"/>
-              </w:rPr>
-              <w:t>dbl</w:t>
-            </w:r>
-            <w:proofErr w:type="spellEnd"/>
-            <w:r>
-              <w:rPr>
-                <w:rFonts w:ascii="Lucida Sans" w:hAnsi="Lucida Sans"/>
-                <w:color w:val="F8F8F2"/>
-                <w:sz w:val="17"/>
-                <w:szCs w:val="17"/>
-              </w:rPr>
-              <w:t>&gt;</w:t>
+              <w:t>&lt;dbl&gt;</w:t>
             </w:r>
           </w:p>
         </w:tc>
@@ -30357,7 +29421,6 @@
                 <w:szCs w:val="18"/>
               </w:rPr>
             </w:pPr>
-            <w:proofErr w:type="spellStart"/>
             <w:r>
               <w:rPr>
                 <w:rFonts w:ascii="Lucida Sans" w:hAnsi="Lucida Sans"/>
@@ -30369,7 +29432,6 @@
               </w:rPr>
               <w:t>alpha_trial</w:t>
             </w:r>
-            <w:proofErr w:type="spellEnd"/>
           </w:p>
           <w:p>
             <w:pPr>
@@ -30388,27 +29450,7 @@
                 <w:sz w:val="17"/>
                 <w:szCs w:val="17"/>
               </w:rPr>
-              <w:t>&lt;</w:t>
-            </w:r>
-            <w:proofErr w:type="spellStart"/>
-            <w:r>
-              <w:rPr>
-                <w:rFonts w:ascii="Lucida Sans" w:hAnsi="Lucida Sans"/>
-                <w:color w:val="F8F8F2"/>
-                <w:sz w:val="17"/>
-                <w:szCs w:val="17"/>
-              </w:rPr>
-              <w:t>dbl</w:t>
-            </w:r>
-            <w:proofErr w:type="spellEnd"/>
-            <w:r>
-              <w:rPr>
-                <w:rFonts w:ascii="Lucida Sans" w:hAnsi="Lucida Sans"/>
-                <w:color w:val="F8F8F2"/>
-                <w:sz w:val="17"/>
-                <w:szCs w:val="17"/>
-              </w:rPr>
-              <w:t>&gt;</w:t>
+              <w:t>&lt;dbl&gt;</w:t>
             </w:r>
           </w:p>
         </w:tc>
@@ -30443,7 +29485,6 @@
                 <w:szCs w:val="18"/>
               </w:rPr>
             </w:pPr>
-            <w:proofErr w:type="spellStart"/>
             <w:r>
               <w:rPr>
                 <w:rFonts w:ascii="Lucida Sans" w:hAnsi="Lucida Sans"/>
@@ -30455,7 +29496,6 @@
               </w:rPr>
               <w:t>kappa_trial</w:t>
             </w:r>
-            <w:proofErr w:type="spellEnd"/>
           </w:p>
           <w:p>
             <w:pPr>
@@ -30474,27 +29514,7 @@
                 <w:sz w:val="17"/>
                 <w:szCs w:val="17"/>
               </w:rPr>
-              <w:t>&lt;</w:t>
-            </w:r>
-            <w:proofErr w:type="spellStart"/>
-            <w:r>
-              <w:rPr>
-                <w:rFonts w:ascii="Lucida Sans" w:hAnsi="Lucida Sans"/>
-                <w:color w:val="F8F8F2"/>
-                <w:sz w:val="17"/>
-                <w:szCs w:val="17"/>
-              </w:rPr>
-              <w:t>dbl</w:t>
-            </w:r>
-            <w:proofErr w:type="spellEnd"/>
-            <w:r>
-              <w:rPr>
-                <w:rFonts w:ascii="Lucida Sans" w:hAnsi="Lucida Sans"/>
-                <w:color w:val="F8F8F2"/>
-                <w:sz w:val="17"/>
-                <w:szCs w:val="17"/>
-              </w:rPr>
-              <w:t>&gt;</w:t>
+              <w:t>&lt;dbl&gt;</w:t>
             </w:r>
           </w:p>
         </w:tc>
@@ -30558,27 +29578,7 @@
                 <w:sz w:val="17"/>
                 <w:szCs w:val="17"/>
               </w:rPr>
-              <w:t>&lt;</w:t>
-            </w:r>
-            <w:proofErr w:type="spellStart"/>
-            <w:r>
-              <w:rPr>
-                <w:rFonts w:ascii="Lucida Sans" w:hAnsi="Lucida Sans"/>
-                <w:color w:val="F8F8F2"/>
-                <w:sz w:val="17"/>
-                <w:szCs w:val="17"/>
-              </w:rPr>
-              <w:t>dbl</w:t>
-            </w:r>
-            <w:proofErr w:type="spellEnd"/>
-            <w:r>
-              <w:rPr>
-                <w:rFonts w:ascii="Lucida Sans" w:hAnsi="Lucida Sans"/>
-                <w:color w:val="F8F8F2"/>
-                <w:sz w:val="17"/>
-                <w:szCs w:val="17"/>
-              </w:rPr>
-              <w:t>&gt;</w:t>
+              <w:t>&lt;dbl&gt;</w:t>
             </w:r>
           </w:p>
         </w:tc>
@@ -30642,27 +29642,7 @@
                 <w:sz w:val="17"/>
                 <w:szCs w:val="17"/>
               </w:rPr>
-              <w:t>&lt;</w:t>
-            </w:r>
-            <w:proofErr w:type="spellStart"/>
-            <w:r>
-              <w:rPr>
-                <w:rFonts w:ascii="Lucida Sans" w:hAnsi="Lucida Sans"/>
-                <w:color w:val="F8F8F2"/>
-                <w:sz w:val="17"/>
-                <w:szCs w:val="17"/>
-              </w:rPr>
-              <w:t>dbl</w:t>
-            </w:r>
-            <w:proofErr w:type="spellEnd"/>
-            <w:r>
-              <w:rPr>
-                <w:rFonts w:ascii="Lucida Sans" w:hAnsi="Lucida Sans"/>
-                <w:color w:val="F8F8F2"/>
-                <w:sz w:val="17"/>
-                <w:szCs w:val="17"/>
-              </w:rPr>
-              <w:t>&gt;</w:t>
+              <w:t>&lt;dbl&gt;</w:t>
             </w:r>
           </w:p>
         </w:tc>
@@ -30726,27 +29706,7 @@
                 <w:sz w:val="17"/>
                 <w:szCs w:val="17"/>
               </w:rPr>
-              <w:t>&lt;</w:t>
-            </w:r>
-            <w:proofErr w:type="spellStart"/>
-            <w:r>
-              <w:rPr>
-                <w:rFonts w:ascii="Lucida Sans" w:hAnsi="Lucida Sans"/>
-                <w:color w:val="F8F8F2"/>
-                <w:sz w:val="17"/>
-                <w:szCs w:val="17"/>
-              </w:rPr>
-              <w:t>dbl</w:t>
-            </w:r>
-            <w:proofErr w:type="spellEnd"/>
-            <w:r>
-              <w:rPr>
-                <w:rFonts w:ascii="Lucida Sans" w:hAnsi="Lucida Sans"/>
-                <w:color w:val="F8F8F2"/>
-                <w:sz w:val="17"/>
-                <w:szCs w:val="17"/>
-              </w:rPr>
-              <w:t>&gt;</w:t>
+              <w:t>&lt;dbl&gt;</w:t>
             </w:r>
           </w:p>
         </w:tc>
@@ -30810,27 +29770,7 @@
                 <w:sz w:val="17"/>
                 <w:szCs w:val="17"/>
               </w:rPr>
-              <w:t>&lt;</w:t>
-            </w:r>
-            <w:proofErr w:type="spellStart"/>
-            <w:r>
-              <w:rPr>
-                <w:rFonts w:ascii="Lucida Sans" w:hAnsi="Lucida Sans"/>
-                <w:color w:val="F8F8F2"/>
-                <w:sz w:val="17"/>
-                <w:szCs w:val="17"/>
-              </w:rPr>
-              <w:t>dbl</w:t>
-            </w:r>
-            <w:proofErr w:type="spellEnd"/>
-            <w:r>
-              <w:rPr>
-                <w:rFonts w:ascii="Lucida Sans" w:hAnsi="Lucida Sans"/>
-                <w:color w:val="F8F8F2"/>
-                <w:sz w:val="17"/>
-                <w:szCs w:val="17"/>
-              </w:rPr>
-              <w:t>&gt;</w:t>
+              <w:t>&lt;dbl&gt;</w:t>
             </w:r>
           </w:p>
         </w:tc>
@@ -34075,7 +33015,6 @@
                 <w:szCs w:val="18"/>
               </w:rPr>
             </w:pPr>
-            <w:proofErr w:type="spellStart"/>
             <w:r>
               <w:rPr>
                 <w:rFonts w:ascii="Lucida Sans" w:hAnsi="Lucida Sans"/>
@@ -34087,7 +33026,6 @@
               </w:rPr>
               <w:t>uid</w:t>
             </w:r>
-            <w:proofErr w:type="spellEnd"/>
           </w:p>
           <w:p>
             <w:pPr>
@@ -34139,7 +33077,6 @@
                 <w:szCs w:val="18"/>
               </w:rPr>
             </w:pPr>
-            <w:proofErr w:type="spellStart"/>
             <w:r>
               <w:rPr>
                 <w:rFonts w:ascii="Lucida Sans" w:hAnsi="Lucida Sans"/>
@@ -34151,7 +33088,6 @@
               </w:rPr>
               <w:t>cond_label</w:t>
             </w:r>
-            <w:proofErr w:type="spellEnd"/>
           </w:p>
           <w:p>
             <w:pPr>
@@ -34204,7 +33140,6 @@
                 <w:szCs w:val="18"/>
               </w:rPr>
             </w:pPr>
-            <w:proofErr w:type="spellStart"/>
             <w:r>
               <w:rPr>
                 <w:rFonts w:ascii="Lucida Sans" w:hAnsi="Lucida Sans"/>
@@ -34216,7 +33151,6 @@
               </w:rPr>
               <w:t>alpha_trial</w:t>
             </w:r>
-            <w:proofErr w:type="spellEnd"/>
           </w:p>
           <w:p>
             <w:pPr>
@@ -34235,27 +33169,7 @@
                 <w:sz w:val="17"/>
                 <w:szCs w:val="17"/>
               </w:rPr>
-              <w:t>&lt;</w:t>
-            </w:r>
-            <w:proofErr w:type="spellStart"/>
-            <w:r>
-              <w:rPr>
-                <w:rFonts w:ascii="Lucida Sans" w:hAnsi="Lucida Sans"/>
-                <w:color w:val="F8F8F2"/>
-                <w:sz w:val="17"/>
-                <w:szCs w:val="17"/>
-              </w:rPr>
-              <w:t>dbl</w:t>
-            </w:r>
-            <w:proofErr w:type="spellEnd"/>
-            <w:r>
-              <w:rPr>
-                <w:rFonts w:ascii="Lucida Sans" w:hAnsi="Lucida Sans"/>
-                <w:color w:val="F8F8F2"/>
-                <w:sz w:val="17"/>
-                <w:szCs w:val="17"/>
-              </w:rPr>
-              <w:t>&gt;</w:t>
+              <w:t>&lt;dbl&gt;</w:t>
             </w:r>
           </w:p>
         </w:tc>
@@ -34290,7 +33204,6 @@
                 <w:szCs w:val="18"/>
               </w:rPr>
             </w:pPr>
-            <w:proofErr w:type="spellStart"/>
             <w:r>
               <w:rPr>
                 <w:rFonts w:ascii="Lucida Sans" w:hAnsi="Lucida Sans"/>
@@ -34302,7 +33215,6 @@
               </w:rPr>
               <w:t>kappa_trial</w:t>
             </w:r>
-            <w:proofErr w:type="spellEnd"/>
           </w:p>
           <w:p>
             <w:pPr>
@@ -34321,27 +33233,7 @@
                 <w:sz w:val="17"/>
                 <w:szCs w:val="17"/>
               </w:rPr>
-              <w:t>&lt;</w:t>
-            </w:r>
-            <w:proofErr w:type="spellStart"/>
-            <w:r>
-              <w:rPr>
-                <w:rFonts w:ascii="Lucida Sans" w:hAnsi="Lucida Sans"/>
-                <w:color w:val="F8F8F2"/>
-                <w:sz w:val="17"/>
-                <w:szCs w:val="17"/>
-              </w:rPr>
-              <w:t>dbl</w:t>
-            </w:r>
-            <w:proofErr w:type="spellEnd"/>
-            <w:r>
-              <w:rPr>
-                <w:rFonts w:ascii="Lucida Sans" w:hAnsi="Lucida Sans"/>
-                <w:color w:val="F8F8F2"/>
-                <w:sz w:val="17"/>
-                <w:szCs w:val="17"/>
-              </w:rPr>
-              <w:t>&gt;</w:t>
+              <w:t>&lt;dbl&gt;</w:t>
             </w:r>
           </w:p>
         </w:tc>
@@ -34376,7 +33268,6 @@
                 <w:szCs w:val="18"/>
               </w:rPr>
             </w:pPr>
-            <w:proofErr w:type="spellStart"/>
             <w:r>
               <w:rPr>
                 <w:rFonts w:ascii="Lucida Sans" w:hAnsi="Lucida Sans"/>
@@ -34388,7 +33279,6 @@
               </w:rPr>
               <w:t>cir_sd_deg</w:t>
             </w:r>
-            <w:proofErr w:type="spellEnd"/>
           </w:p>
           <w:p>
             <w:pPr>
@@ -34407,27 +33297,7 @@
                 <w:sz w:val="17"/>
                 <w:szCs w:val="17"/>
               </w:rPr>
-              <w:t>&lt;</w:t>
-            </w:r>
-            <w:proofErr w:type="spellStart"/>
-            <w:r>
-              <w:rPr>
-                <w:rFonts w:ascii="Lucida Sans" w:hAnsi="Lucida Sans"/>
-                <w:color w:val="F8F8F2"/>
-                <w:sz w:val="17"/>
-                <w:szCs w:val="17"/>
-              </w:rPr>
-              <w:t>dbl</w:t>
-            </w:r>
-            <w:proofErr w:type="spellEnd"/>
-            <w:r>
-              <w:rPr>
-                <w:rFonts w:ascii="Lucida Sans" w:hAnsi="Lucida Sans"/>
-                <w:color w:val="F8F8F2"/>
-                <w:sz w:val="17"/>
-                <w:szCs w:val="17"/>
-              </w:rPr>
-              <w:t>&gt;</w:t>
+              <w:t>&lt;dbl&gt;</w:t>
             </w:r>
           </w:p>
         </w:tc>
@@ -34462,7 +33332,6 @@
                 <w:szCs w:val="18"/>
               </w:rPr>
             </w:pPr>
-            <w:proofErr w:type="spellStart"/>
             <w:r>
               <w:rPr>
                 <w:rFonts w:ascii="Lucida Sans" w:hAnsi="Lucida Sans"/>
@@ -34474,7 +33343,6 @@
               </w:rPr>
               <w:t>vm_cir_sd_deg</w:t>
             </w:r>
-            <w:proofErr w:type="spellEnd"/>
           </w:p>
           <w:p>
             <w:pPr>
@@ -34493,27 +33361,7 @@
                 <w:sz w:val="17"/>
                 <w:szCs w:val="17"/>
               </w:rPr>
-              <w:t>&lt;</w:t>
-            </w:r>
-            <w:proofErr w:type="spellStart"/>
-            <w:r>
-              <w:rPr>
-                <w:rFonts w:ascii="Lucida Sans" w:hAnsi="Lucida Sans"/>
-                <w:color w:val="F8F8F2"/>
-                <w:sz w:val="17"/>
-                <w:szCs w:val="17"/>
-              </w:rPr>
-              <w:t>dbl</w:t>
-            </w:r>
-            <w:proofErr w:type="spellEnd"/>
-            <w:r>
-              <w:rPr>
-                <w:rFonts w:ascii="Lucida Sans" w:hAnsi="Lucida Sans"/>
-                <w:color w:val="F8F8F2"/>
-                <w:sz w:val="17"/>
-                <w:szCs w:val="17"/>
-              </w:rPr>
-              <w:t>&gt;</w:t>
+              <w:t>&lt;dbl&gt;</w:t>
             </w:r>
           </w:p>
         </w:tc>
@@ -36586,11 +35434,9 @@
             <w:tcW w:w="1276" w:type="dxa"/>
           </w:tcPr>
           <w:p>
-            <w:proofErr w:type="spellStart"/>
             <w:r>
               <w:t>cSD</w:t>
             </w:r>
-            <w:proofErr w:type="spellEnd"/>
           </w:p>
         </w:tc>
       </w:tr>
@@ -36621,15 +35467,7 @@
           </w:tcPr>
           <w:p>
             <w:r>
-              <w:t>35 (</w:t>
-            </w:r>
-            <w:proofErr w:type="spellStart"/>
-            <w:r>
-              <w:t>ub</w:t>
-            </w:r>
-            <w:proofErr w:type="spellEnd"/>
-            <w:r>
-              <w:t>)</w:t>
+              <w:t>35 (ub)</w:t>
             </w:r>
           </w:p>
         </w:tc>
@@ -38257,15 +37095,7 @@
           </w:tcPr>
           <w:p>
             <w:r>
-              <w:t>35 (</w:t>
-            </w:r>
-            <w:proofErr w:type="spellStart"/>
-            <w:r>
-              <w:t>ub</w:t>
-            </w:r>
-            <w:proofErr w:type="spellEnd"/>
-            <w:r>
-              <w:t>)</w:t>
+              <w:t>35 (ub)</w:t>
             </w:r>
           </w:p>
         </w:tc>
@@ -39073,15 +37903,7 @@
           </w:tcPr>
           <w:p>
             <w:r>
-              <w:t>35 (</w:t>
-            </w:r>
-            <w:proofErr w:type="spellStart"/>
-            <w:r>
-              <w:t>ub</w:t>
-            </w:r>
-            <w:proofErr w:type="spellEnd"/>
-            <w:r>
-              <w:t>)</w:t>
+              <w:t>35 (ub)</w:t>
             </w:r>
           </w:p>
         </w:tc>
@@ -40681,23 +39503,7 @@
         <w:t>n</w:t>
       </w:r>
       <w:r>
-        <w:t xml:space="preserve"> </w:t>
-      </w:r>
-      <w:proofErr w:type="spellStart"/>
-      <w:r>
-        <w:t>alpha_beta</w:t>
-      </w:r>
-      <w:proofErr w:type="spellEnd"/>
-      <w:r>
-        <w:t xml:space="preserve"> model with 2 </w:t>
-      </w:r>
-      <w:proofErr w:type="spellStart"/>
-      <w:r>
-        <w:t>kappas</w:t>
-      </w:r>
-      <w:proofErr w:type="spellEnd"/>
-      <w:r>
-        <w:t xml:space="preserve"> (one for ci6 conditions, the other for all else)</w:t>
+        <w:t xml:space="preserve"> alpha_beta model with 2 kappas (one for ci6 conditions, the other for all else)</w:t>
       </w:r>
       <w:r>
         <w:t xml:space="preserve">. </w:t>
@@ -40850,11 +39656,9 @@
             <w:tcW w:w="1276" w:type="dxa"/>
           </w:tcPr>
           <w:p>
-            <w:proofErr w:type="spellStart"/>
             <w:r>
               <w:t>cSD</w:t>
             </w:r>
-            <w:proofErr w:type="spellEnd"/>
           </w:p>
         </w:tc>
       </w:tr>
@@ -42147,7 +40951,6 @@
             <w:r>
               <w:t>2193</w:t>
             </w:r>
-            <w:proofErr w:type="gramStart"/>
             <w:r>
               <w:t xml:space="preserve">) </w:t>
             </w:r>
@@ -42155,11 +40958,7 @@
               <w:t xml:space="preserve"> </w:t>
             </w:r>
             <w:r>
-              <w:t>AIC</w:t>
-            </w:r>
-            <w:proofErr w:type="gramEnd"/>
-            <w:r>
-              <w:t xml:space="preserve"> </w:t>
+              <w:t xml:space="preserve">AIC </w:t>
             </w:r>
             <w:r>
               <w:t>4610.58</w:t>
@@ -42170,13 +40969,8 @@
             <w:r>
               <w:t>4422</w:t>
             </w:r>
-            <w:proofErr w:type="gramStart"/>
-            <w:r>
-              <w:t>)  BIC</w:t>
-            </w:r>
-            <w:proofErr w:type="gramEnd"/>
-            <w:r>
-              <w:t xml:space="preserve"> </w:t>
+            <w:r>
+              <w:t xml:space="preserve">)  BIC </w:t>
             </w:r>
             <w:r>
               <w:t>4686.2</w:t>
@@ -42191,15 +40985,7 @@
               <w:t>4535</w:t>
             </w:r>
             <w:r>
-              <w:t xml:space="preserve">) </w:t>
-            </w:r>
-            <w:proofErr w:type="spellStart"/>
-            <w:r>
-              <w:t>Cvg</w:t>
-            </w:r>
-            <w:proofErr w:type="spellEnd"/>
-            <w:r>
-              <w:t xml:space="preserve"> </w:t>
+              <w:t xml:space="preserve">) Cvg </w:t>
             </w:r>
             <w:r>
               <w:rPr>
@@ -43559,15 +42345,7 @@
               <w:t>(5740)</w:t>
             </w:r>
             <w:r>
-              <w:t xml:space="preserve"> </w:t>
-            </w:r>
-            <w:proofErr w:type="spellStart"/>
-            <w:r>
-              <w:t>Cvg</w:t>
-            </w:r>
-            <w:proofErr w:type="spellEnd"/>
-            <w:r>
-              <w:t xml:space="preserve"> 0</w:t>
+              <w:t xml:space="preserve"> Cvg 0</w:t>
             </w:r>
             <w:r>
               <w:t xml:space="preserve"> Beta: .027 .942 .977</w:t>
@@ -44874,7 +43652,6 @@
             <w:r>
               <w:t>2897</w:t>
             </w:r>
-            <w:proofErr w:type="gramStart"/>
             <w:r>
               <w:t>)</w:t>
             </w:r>
@@ -44882,11 +43659,7 @@
               <w:t xml:space="preserve"> </w:t>
             </w:r>
             <w:r>
-              <w:t xml:space="preserve"> AIC</w:t>
-            </w:r>
-            <w:proofErr w:type="gramEnd"/>
-            <w:r>
-              <w:t xml:space="preserve"> </w:t>
+              <w:t xml:space="preserve"> AIC </w:t>
             </w:r>
             <w:r>
               <w:t>5844.167</w:t>
@@ -44897,13 +43670,8 @@
             <w:r>
               <w:t>5831</w:t>
             </w:r>
-            <w:proofErr w:type="gramStart"/>
-            <w:r>
-              <w:t>)  BIC</w:t>
-            </w:r>
-            <w:proofErr w:type="gramEnd"/>
-            <w:r>
-              <w:t xml:space="preserve"> </w:t>
+            <w:r>
+              <w:t xml:space="preserve">)  BIC </w:t>
             </w:r>
             <w:r>
               <w:t>5919.844</w:t>
@@ -44918,15 +43686,7 @@
               <w:t>)</w:t>
             </w:r>
             <w:r>
-              <w:t xml:space="preserve"> </w:t>
-            </w:r>
-            <w:proofErr w:type="spellStart"/>
-            <w:r>
-              <w:t>Cvg</w:t>
-            </w:r>
-            <w:proofErr w:type="spellEnd"/>
-            <w:r>
-              <w:t xml:space="preserve"> 0</w:t>
+              <w:t xml:space="preserve"> Cvg 0</w:t>
             </w:r>
             <w:r>
               <w:t xml:space="preserve">; </w:t>
@@ -45001,15 +43761,7 @@
               <w:t>35</w:t>
             </w:r>
             <w:r>
-              <w:t xml:space="preserve"> (</w:t>
-            </w:r>
-            <w:proofErr w:type="spellStart"/>
-            <w:r>
-              <w:t>ub</w:t>
-            </w:r>
-            <w:proofErr w:type="spellEnd"/>
-            <w:r>
-              <w:t>)</w:t>
+              <w:t xml:space="preserve"> (ub)</w:t>
             </w:r>
           </w:p>
         </w:tc>
@@ -46262,7 +45014,6 @@
             <w:r>
               <w:t>1155</w:t>
             </w:r>
-            <w:proofErr w:type="gramStart"/>
             <w:r>
               <w:t>)</w:t>
             </w:r>
@@ -46270,57 +45021,40 @@
               <w:t xml:space="preserve"> </w:t>
             </w:r>
             <w:r>
-              <w:t xml:space="preserve"> AIC</w:t>
-            </w:r>
-            <w:proofErr w:type="gramEnd"/>
+              <w:t xml:space="preserve"> AIC </w:t>
+            </w:r>
+            <w:r>
+              <w:t>2254.866</w:t>
+            </w:r>
+            <w:r>
+              <w:t>(</w:t>
+            </w:r>
+            <w:r>
+              <w:t>2346</w:t>
+            </w:r>
+            <w:r>
+              <w:t xml:space="preserve">) </w:t>
+            </w:r>
             <w:r>
               <w:t xml:space="preserve"> </w:t>
             </w:r>
             <w:r>
-              <w:t>2254.866</w:t>
+              <w:t xml:space="preserve">BIC </w:t>
+            </w:r>
+            <w:r>
+              <w:t>2330.543</w:t>
             </w:r>
             <w:r>
               <w:t>(</w:t>
             </w:r>
             <w:r>
-              <w:t>2346</w:t>
-            </w:r>
-            <w:proofErr w:type="gramStart"/>
-            <w:r>
-              <w:t xml:space="preserve">) </w:t>
-            </w:r>
-            <w:r>
-              <w:t xml:space="preserve"> </w:t>
-            </w:r>
-            <w:r>
-              <w:t>BIC</w:t>
-            </w:r>
-            <w:proofErr w:type="gramEnd"/>
-            <w:r>
-              <w:t xml:space="preserve"> </w:t>
-            </w:r>
-            <w:r>
-              <w:t>2330.543</w:t>
-            </w:r>
-            <w:r>
-              <w:t>(</w:t>
-            </w:r>
-            <w:r>
               <w:t>2459</w:t>
             </w:r>
             <w:r>
               <w:t>)</w:t>
             </w:r>
             <w:r>
-              <w:t xml:space="preserve"> </w:t>
-            </w:r>
-            <w:proofErr w:type="spellStart"/>
-            <w:r>
-              <w:t>Cvg</w:t>
-            </w:r>
-            <w:proofErr w:type="spellEnd"/>
-            <w:r>
-              <w:t xml:space="preserve"> 0 Beta: .02</w:t>
+              <w:t xml:space="preserve"> Cvg 0 Beta: .02</w:t>
             </w:r>
             <w:r>
               <w:t>0</w:t>
@@ -46415,15 +45149,7 @@
               <w:t>9</w:t>
             </w:r>
             <w:r>
-              <w:t xml:space="preserve"> (</w:t>
-            </w:r>
-            <w:proofErr w:type="spellStart"/>
-            <w:r>
-              <w:t>ub</w:t>
-            </w:r>
-            <w:proofErr w:type="spellEnd"/>
-            <w:r>
-              <w:t>)</w:t>
+              <w:t xml:space="preserve"> (ub)</w:t>
             </w:r>
           </w:p>
         </w:tc>
@@ -47656,59 +46382,41 @@
             <w:r>
               <w:t>1214</w:t>
             </w:r>
-            <w:proofErr w:type="gramStart"/>
-            <w:r>
-              <w:t>)  AIC</w:t>
-            </w:r>
-            <w:proofErr w:type="gramEnd"/>
+            <w:r>
+              <w:t xml:space="preserve">)  AIC </w:t>
+            </w:r>
+            <w:r>
+              <w:t>2596.341</w:t>
+            </w:r>
+            <w:r>
+              <w:t>(</w:t>
+            </w:r>
+            <w:r>
+              <w:t>2465</w:t>
+            </w:r>
+            <w:r>
+              <w:t xml:space="preserve">) </w:t>
+            </w:r>
             <w:r>
               <w:t xml:space="preserve"> </w:t>
             </w:r>
             <w:r>
-              <w:t>2596.341</w:t>
+              <w:t xml:space="preserve">BIC </w:t>
+            </w:r>
+            <w:r>
+              <w:t>2672.019</w:t>
             </w:r>
             <w:r>
               <w:t>(</w:t>
             </w:r>
             <w:r>
-              <w:t>2465</w:t>
-            </w:r>
-            <w:proofErr w:type="gramStart"/>
-            <w:r>
-              <w:t xml:space="preserve">) </w:t>
-            </w:r>
-            <w:r>
-              <w:t xml:space="preserve"> </w:t>
-            </w:r>
-            <w:r>
-              <w:t>BIC</w:t>
-            </w:r>
-            <w:proofErr w:type="gramEnd"/>
-            <w:r>
-              <w:t xml:space="preserve"> </w:t>
-            </w:r>
-            <w:r>
-              <w:t>2672.019</w:t>
-            </w:r>
-            <w:r>
-              <w:t>(</w:t>
-            </w:r>
-            <w:r>
               <w:t>2578</w:t>
             </w:r>
             <w:r>
               <w:t>)</w:t>
             </w:r>
             <w:r>
-              <w:t xml:space="preserve"> </w:t>
-            </w:r>
-            <w:proofErr w:type="spellStart"/>
-            <w:r>
-              <w:t>Cvg</w:t>
-            </w:r>
-            <w:proofErr w:type="spellEnd"/>
-            <w:r>
-              <w:t xml:space="preserve"> </w:t>
+              <w:t xml:space="preserve"> Cvg </w:t>
             </w:r>
             <w:r>
               <w:rPr>
@@ -48047,7 +46755,6 @@
                 <w:szCs w:val="20"/>
               </w:rPr>
             </w:pPr>
-            <w:proofErr w:type="spellStart"/>
             <w:r>
               <w:rPr>
                 <w:rFonts w:asciiTheme="minorHAnsi" w:hAnsiTheme="minorHAnsi" w:cstheme="minorHAnsi"/>
@@ -48070,7 +46777,6 @@
               </w:rPr>
               <w:t>vg</w:t>
             </w:r>
-            <w:proofErr w:type="spellEnd"/>
           </w:p>
         </w:tc>
       </w:tr>
@@ -49058,14 +47764,12 @@
                 <w:color w:val="000000" w:themeColor="text1"/>
               </w:rPr>
             </w:pPr>
-            <w:proofErr w:type="spellStart"/>
             <w:r>
               <w:rPr>
                 <w:color w:val="000000" w:themeColor="text1"/>
               </w:rPr>
               <w:t>Cnd</w:t>
             </w:r>
-            <w:proofErr w:type="spellEnd"/>
           </w:p>
         </w:tc>
         <w:tc>
@@ -49100,14 +47804,12 @@
                 <w:color w:val="000000" w:themeColor="text1"/>
               </w:rPr>
             </w:pPr>
-            <w:proofErr w:type="spellStart"/>
             <w:r>
               <w:rPr>
                 <w:color w:val="000000" w:themeColor="text1"/>
               </w:rPr>
               <w:t>kap</w:t>
             </w:r>
-            <w:proofErr w:type="spellEnd"/>
           </w:p>
         </w:tc>
         <w:tc>
@@ -49242,14 +47944,12 @@
                 <w:color w:val="000000" w:themeColor="text1"/>
               </w:rPr>
             </w:pPr>
-            <w:proofErr w:type="spellStart"/>
             <w:r>
               <w:rPr>
                 <w:color w:val="000000" w:themeColor="text1"/>
               </w:rPr>
               <w:t>Bnr</w:t>
             </w:r>
-            <w:proofErr w:type="spellEnd"/>
           </w:p>
         </w:tc>
         <w:tc>
@@ -49264,14 +47964,12 @@
                 <w:color w:val="000000" w:themeColor="text1"/>
               </w:rPr>
             </w:pPr>
-            <w:proofErr w:type="spellStart"/>
             <w:r>
               <w:rPr>
                 <w:color w:val="000000" w:themeColor="text1"/>
               </w:rPr>
               <w:t>br</w:t>
             </w:r>
-            <w:proofErr w:type="spellEnd"/>
           </w:p>
         </w:tc>
       </w:tr>
@@ -53118,6 +51816,69 @@
           <w:lang w:val="en-US"/>
         </w:rPr>
       </w:pPr>
+    </w:p>
+    <w:p>
+      <w:pPr>
+        <w:rPr>
+          <w:lang w:val="en-US"/>
+        </w:rPr>
+      </w:pPr>
+    </w:p>
+    <w:p>
+      <w:pPr>
+        <w:rPr>
+          <w:lang w:val="en-US"/>
+        </w:rPr>
+      </w:pPr>
+    </w:p>
+    <w:p>
+      <w:pPr>
+        <w:rPr>
+          <w:lang w:val="en-US"/>
+        </w:rPr>
+      </w:pPr>
+    </w:p>
+    <w:p>
+      <w:pPr>
+        <w:rPr>
+          <w:lang w:val="en-US"/>
+        </w:rPr>
+      </w:pPr>
+    </w:p>
+    <w:p>
+      <w:pPr>
+        <w:rPr>
+          <w:lang w:val="en-US"/>
+        </w:rPr>
+      </w:pPr>
+    </w:p>
+    <w:p>
+      <w:pPr>
+        <w:rPr>
+          <w:lang w:val="en-US"/>
+        </w:rPr>
+      </w:pPr>
+      <w:r>
+        <w:rPr>
+          <w:lang w:val="en-US"/>
+        </w:rPr>
+        <w:lastRenderedPageBreak/>
+        <w:t>Test JPCDM vs POPCDM</w:t>
+      </w:r>
+    </w:p>
+    <w:p>
+      <w:pPr>
+        <w:rPr>
+          <w:rFonts w:hint="eastAsia"/>
+          <w:lang w:val="en-US"/>
+        </w:rPr>
+      </w:pPr>
+      <w:r>
+        <w:rPr>
+          <w:lang w:val="en-US"/>
+        </w:rPr>
+        <w:t>At a high level, JPCDM and POPCDM share the same CDM/FPT machinery, but differ mainly in how they generate the distribution of drift angles.</w:t>
+      </w:r>
     </w:p>
     <w:p/>
     <w:sectPr>

</xml_diff>